<commit_message>
Initial Incentory Items Commit
</commit_message>
<xml_diff>
--- a/Document/Screen Document.docx
+++ b/Document/Screen Document.docx
@@ -7,28 +7,18 @@
         <w:rPr>
           <w:b/>
           <w:bCs/>
-          <w:lang w:val="en-PK"/>
         </w:rPr>
       </w:pPr>
       <w:r>
         <w:rPr>
           <w:b/>
           <w:bCs/>
-          <w:lang w:val="en-PK"/>
         </w:rPr>
         <w:t>1. Small Organization Features</w:t>
       </w:r>
     </w:p>
     <w:p>
-      <w:pPr>
-        <w:rPr>
-          <w:lang w:val="en-PK"/>
-        </w:rPr>
-      </w:pPr>
-      <w:r>
-        <w:rPr>
-          <w:lang w:val="en-PK"/>
-        </w:rPr>
+      <w:r>
         <w:t>These features focus on fundamental inventory management and operational efficiency.</w:t>
       </w:r>
     </w:p>
@@ -37,14 +27,12 @@
         <w:rPr>
           <w:b/>
           <w:bCs/>
-          <w:lang w:val="en-PK"/>
         </w:rPr>
       </w:pPr>
       <w:r>
         <w:rPr>
           <w:b/>
           <w:bCs/>
-          <w:lang w:val="en-PK"/>
         </w:rPr>
         <w:t>Inventory Management</w:t>
       </w:r>
@@ -55,14 +43,8 @@
           <w:ilvl w:val="0"/>
           <w:numId w:val="1"/>
         </w:numPr>
-        <w:rPr>
-          <w:lang w:val="en-PK"/>
-        </w:rPr>
-      </w:pPr>
-      <w:r>
-        <w:rPr>
-          <w:lang w:val="en-PK"/>
-        </w:rPr>
+      </w:pPr>
+      <w:r>
         <w:t>Add/Edit/Delete inventory items</w:t>
       </w:r>
     </w:p>
@@ -72,14 +54,8 @@
           <w:ilvl w:val="0"/>
           <w:numId w:val="1"/>
         </w:numPr>
-        <w:rPr>
-          <w:lang w:val="en-PK"/>
-        </w:rPr>
-      </w:pPr>
-      <w:r>
-        <w:rPr>
-          <w:lang w:val="en-PK"/>
-        </w:rPr>
+      </w:pPr>
+      <w:r>
         <w:t>Track stock levels (quantity in/out)</w:t>
       </w:r>
     </w:p>
@@ -89,14 +65,8 @@
           <w:ilvl w:val="0"/>
           <w:numId w:val="1"/>
         </w:numPr>
-        <w:rPr>
-          <w:lang w:val="en-PK"/>
-        </w:rPr>
-      </w:pPr>
-      <w:r>
-        <w:rPr>
-          <w:lang w:val="en-PK"/>
-        </w:rPr>
+      </w:pPr>
+      <w:r>
         <w:t>Categorize inventory (e.g., office supplies, IT equipment)</w:t>
       </w:r>
     </w:p>
@@ -106,14 +76,8 @@
           <w:ilvl w:val="0"/>
           <w:numId w:val="1"/>
         </w:numPr>
-        <w:rPr>
-          <w:lang w:val="en-PK"/>
-        </w:rPr>
-      </w:pPr>
-      <w:r>
-        <w:rPr>
-          <w:lang w:val="en-PK"/>
-        </w:rPr>
+      </w:pPr>
+      <w:r>
         <w:t>Barcode/QR code for inventory identification</w:t>
       </w:r>
     </w:p>
@@ -123,14 +87,8 @@
           <w:ilvl w:val="0"/>
           <w:numId w:val="1"/>
         </w:numPr>
-        <w:rPr>
-          <w:lang w:val="en-PK"/>
-        </w:rPr>
-      </w:pPr>
-      <w:r>
-        <w:rPr>
-          <w:lang w:val="en-PK"/>
-        </w:rPr>
+      </w:pPr>
+      <w:r>
         <w:t>Low stock alerts</w:t>
       </w:r>
     </w:p>
@@ -139,14 +97,12 @@
         <w:rPr>
           <w:b/>
           <w:bCs/>
-          <w:lang w:val="en-PK"/>
         </w:rPr>
       </w:pPr>
       <w:r>
         <w:rPr>
           <w:b/>
           <w:bCs/>
-          <w:lang w:val="en-PK"/>
         </w:rPr>
         <w:t>Purchase Management</w:t>
       </w:r>
@@ -157,14 +113,8 @@
           <w:ilvl w:val="0"/>
           <w:numId w:val="2"/>
         </w:numPr>
-        <w:rPr>
-          <w:lang w:val="en-PK"/>
-        </w:rPr>
-      </w:pPr>
-      <w:r>
-        <w:rPr>
-          <w:lang w:val="en-PK"/>
-        </w:rPr>
+      </w:pPr>
+      <w:r>
         <w:t>Raise purchase orders (PO)</w:t>
       </w:r>
     </w:p>
@@ -174,14 +124,8 @@
           <w:ilvl w:val="0"/>
           <w:numId w:val="2"/>
         </w:numPr>
-        <w:rPr>
-          <w:lang w:val="en-PK"/>
-        </w:rPr>
-      </w:pPr>
-      <w:r>
-        <w:rPr>
-          <w:lang w:val="en-PK"/>
-        </w:rPr>
+      </w:pPr>
+      <w:r>
         <w:t>Track PO statuses (pending, approved, received)</w:t>
       </w:r>
     </w:p>
@@ -191,14 +135,8 @@
           <w:ilvl w:val="0"/>
           <w:numId w:val="2"/>
         </w:numPr>
-        <w:rPr>
-          <w:lang w:val="en-PK"/>
-        </w:rPr>
-      </w:pPr>
-      <w:r>
-        <w:rPr>
-          <w:lang w:val="en-PK"/>
-        </w:rPr>
+      </w:pPr>
+      <w:r>
         <w:t>Simple supplier management (add/edit supplier details)</w:t>
       </w:r>
     </w:p>
@@ -208,14 +146,8 @@
           <w:ilvl w:val="0"/>
           <w:numId w:val="2"/>
         </w:numPr>
-        <w:rPr>
-          <w:lang w:val="en-PK"/>
-        </w:rPr>
-      </w:pPr>
-      <w:r>
-        <w:rPr>
-          <w:lang w:val="en-PK"/>
-        </w:rPr>
+      </w:pPr>
+      <w:r>
         <w:t>Invoice and receipt tracking</w:t>
       </w:r>
     </w:p>
@@ -224,14 +156,12 @@
         <w:rPr>
           <w:b/>
           <w:bCs/>
-          <w:lang w:val="en-PK"/>
         </w:rPr>
       </w:pPr>
       <w:r>
         <w:rPr>
           <w:b/>
           <w:bCs/>
-          <w:lang w:val="en-PK"/>
         </w:rPr>
         <w:t>Reporting</w:t>
       </w:r>
@@ -242,14 +172,8 @@
           <w:ilvl w:val="0"/>
           <w:numId w:val="3"/>
         </w:numPr>
-        <w:rPr>
-          <w:lang w:val="en-PK"/>
-        </w:rPr>
-      </w:pPr>
-      <w:r>
-        <w:rPr>
-          <w:lang w:val="en-PK"/>
-        </w:rPr>
+      </w:pPr>
+      <w:r>
         <w:t>Basic inventory reports (e.g., stock levels, purchase history)</w:t>
       </w:r>
     </w:p>
@@ -259,14 +183,8 @@
           <w:ilvl w:val="0"/>
           <w:numId w:val="3"/>
         </w:numPr>
-        <w:rPr>
-          <w:lang w:val="en-PK"/>
-        </w:rPr>
-      </w:pPr>
-      <w:r>
-        <w:rPr>
-          <w:lang w:val="en-PK"/>
-        </w:rPr>
+      </w:pPr>
+      <w:r>
         <w:t>Low stock and critical item alerts</w:t>
       </w:r>
     </w:p>
@@ -276,14 +194,8 @@
           <w:ilvl w:val="0"/>
           <w:numId w:val="3"/>
         </w:numPr>
-        <w:rPr>
-          <w:lang w:val="en-PK"/>
-        </w:rPr>
-      </w:pPr>
-      <w:r>
-        <w:rPr>
-          <w:lang w:val="en-PK"/>
-        </w:rPr>
+      </w:pPr>
+      <w:r>
         <w:t>Supplier performance summary</w:t>
       </w:r>
     </w:p>
@@ -292,14 +204,12 @@
         <w:rPr>
           <w:b/>
           <w:bCs/>
-          <w:lang w:val="en-PK"/>
         </w:rPr>
       </w:pPr>
       <w:r>
         <w:rPr>
           <w:b/>
           <w:bCs/>
-          <w:lang w:val="en-PK"/>
         </w:rPr>
         <w:t>User Management</w:t>
       </w:r>
@@ -310,14 +220,8 @@
           <w:ilvl w:val="0"/>
           <w:numId w:val="4"/>
         </w:numPr>
-        <w:rPr>
-          <w:lang w:val="en-PK"/>
-        </w:rPr>
-      </w:pPr>
-      <w:r>
-        <w:rPr>
-          <w:lang w:val="en-PK"/>
-        </w:rPr>
+      </w:pPr>
+      <w:r>
         <w:t>User roles and permissions (Admin, Employee)</w:t>
       </w:r>
     </w:p>
@@ -327,14 +231,8 @@
           <w:ilvl w:val="0"/>
           <w:numId w:val="4"/>
         </w:numPr>
-        <w:rPr>
-          <w:lang w:val="en-PK"/>
-        </w:rPr>
-      </w:pPr>
-      <w:r>
-        <w:rPr>
-          <w:lang w:val="en-PK"/>
-        </w:rPr>
+      </w:pPr>
+      <w:r>
         <w:t>Login and authentication</w:t>
       </w:r>
     </w:p>
@@ -354,29 +252,19 @@
         <w:rPr>
           <w:b/>
           <w:bCs/>
-          <w:lang w:val="en-PK"/>
         </w:rPr>
       </w:pPr>
       <w:r>
         <w:rPr>
           <w:b/>
           <w:bCs/>
-          <w:lang w:val="en-PK"/>
         </w:rPr>
         <w:lastRenderedPageBreak/>
         <w:t>2. Medium Organization Features</w:t>
       </w:r>
     </w:p>
     <w:p>
-      <w:pPr>
-        <w:rPr>
-          <w:lang w:val="en-PK"/>
-        </w:rPr>
-      </w:pPr>
-      <w:r>
-        <w:rPr>
-          <w:lang w:val="en-PK"/>
-        </w:rPr>
+      <w:r>
         <w:t>These features accommodate more complex operations and scale.</w:t>
       </w:r>
     </w:p>
@@ -385,14 +273,12 @@
         <w:rPr>
           <w:b/>
           <w:bCs/>
-          <w:lang w:val="en-PK"/>
         </w:rPr>
       </w:pPr>
       <w:r>
         <w:rPr>
           <w:b/>
           <w:bCs/>
-          <w:lang w:val="en-PK"/>
         </w:rPr>
         <w:t>Advanced Inventory Management</w:t>
       </w:r>
@@ -403,14 +289,8 @@
           <w:ilvl w:val="0"/>
           <w:numId w:val="5"/>
         </w:numPr>
-        <w:rPr>
-          <w:lang w:val="en-PK"/>
-        </w:rPr>
-      </w:pPr>
-      <w:r>
-        <w:rPr>
-          <w:lang w:val="en-PK"/>
-        </w:rPr>
+      </w:pPr>
+      <w:r>
         <w:t>Batch/lot tracking</w:t>
       </w:r>
     </w:p>
@@ -420,14 +300,8 @@
           <w:ilvl w:val="0"/>
           <w:numId w:val="5"/>
         </w:numPr>
-        <w:rPr>
-          <w:lang w:val="en-PK"/>
-        </w:rPr>
-      </w:pPr>
-      <w:r>
-        <w:rPr>
-          <w:lang w:val="en-PK"/>
-        </w:rPr>
+      </w:pPr>
+      <w:r>
         <w:t>Inventory location tracking (warehouse, floor, department)</w:t>
       </w:r>
     </w:p>
@@ -437,14 +311,8 @@
           <w:ilvl w:val="0"/>
           <w:numId w:val="5"/>
         </w:numPr>
-        <w:rPr>
-          <w:lang w:val="en-PK"/>
-        </w:rPr>
-      </w:pPr>
-      <w:r>
-        <w:rPr>
-          <w:lang w:val="en-PK"/>
-        </w:rPr>
+      </w:pPr>
+      <w:r>
         <w:t>Stock valuation (FIFO, LIFO, Weighted Average)</w:t>
       </w:r>
     </w:p>
@@ -454,14 +322,8 @@
           <w:ilvl w:val="0"/>
           <w:numId w:val="5"/>
         </w:numPr>
-        <w:rPr>
-          <w:lang w:val="en-PK"/>
-        </w:rPr>
-      </w:pPr>
-      <w:r>
-        <w:rPr>
-          <w:lang w:val="en-PK"/>
-        </w:rPr>
+      </w:pPr>
+      <w:r>
         <w:t>Multi-category inventory handling</w:t>
       </w:r>
     </w:p>
@@ -471,14 +333,8 @@
           <w:ilvl w:val="0"/>
           <w:numId w:val="5"/>
         </w:numPr>
-        <w:rPr>
-          <w:lang w:val="en-PK"/>
-        </w:rPr>
-      </w:pPr>
-      <w:r>
-        <w:rPr>
-          <w:lang w:val="en-PK"/>
-        </w:rPr>
+      </w:pPr>
+      <w:r>
         <w:t>Expiry date tracking for perishable items</w:t>
       </w:r>
     </w:p>
@@ -487,14 +343,12 @@
         <w:rPr>
           <w:b/>
           <w:bCs/>
-          <w:lang w:val="en-PK"/>
         </w:rPr>
       </w:pPr>
       <w:r>
         <w:rPr>
           <w:b/>
           <w:bCs/>
-          <w:lang w:val="en-PK"/>
         </w:rPr>
         <w:t>Supplier and Vendor Management</w:t>
       </w:r>
@@ -505,14 +359,8 @@
           <w:ilvl w:val="0"/>
           <w:numId w:val="6"/>
         </w:numPr>
-        <w:rPr>
-          <w:lang w:val="en-PK"/>
-        </w:rPr>
-      </w:pPr>
-      <w:r>
-        <w:rPr>
-          <w:lang w:val="en-PK"/>
-        </w:rPr>
+      </w:pPr>
+      <w:r>
         <w:t>Supplier contracts and history</w:t>
       </w:r>
     </w:p>
@@ -522,14 +370,8 @@
           <w:ilvl w:val="0"/>
           <w:numId w:val="6"/>
         </w:numPr>
-        <w:rPr>
-          <w:lang w:val="en-PK"/>
-        </w:rPr>
-      </w:pPr>
-      <w:r>
-        <w:rPr>
-          <w:lang w:val="en-PK"/>
-        </w:rPr>
+      </w:pPr>
+      <w:r>
         <w:t>Manage multiple suppliers for the same item</w:t>
       </w:r>
     </w:p>
@@ -539,14 +381,8 @@
           <w:ilvl w:val="0"/>
           <w:numId w:val="6"/>
         </w:numPr>
-        <w:rPr>
-          <w:lang w:val="en-PK"/>
-        </w:rPr>
-      </w:pPr>
-      <w:r>
-        <w:rPr>
-          <w:lang w:val="en-PK"/>
-        </w:rPr>
+      </w:pPr>
+      <w:r>
         <w:t>Supplier performance metrics (e.g., delivery time, quality)</w:t>
       </w:r>
     </w:p>
@@ -555,14 +391,12 @@
         <w:rPr>
           <w:b/>
           <w:bCs/>
-          <w:lang w:val="en-PK"/>
         </w:rPr>
       </w:pPr>
       <w:r>
         <w:rPr>
           <w:b/>
           <w:bCs/>
-          <w:lang w:val="en-PK"/>
         </w:rPr>
         <w:t>Procurement Management</w:t>
       </w:r>
@@ -573,14 +407,8 @@
           <w:ilvl w:val="0"/>
           <w:numId w:val="7"/>
         </w:numPr>
-        <w:rPr>
-          <w:lang w:val="en-PK"/>
-        </w:rPr>
-      </w:pPr>
-      <w:r>
-        <w:rPr>
-          <w:lang w:val="en-PK"/>
-        </w:rPr>
+      </w:pPr>
+      <w:r>
         <w:t>Multi-level PO approval workflows</w:t>
       </w:r>
     </w:p>
@@ -590,14 +418,8 @@
           <w:ilvl w:val="0"/>
           <w:numId w:val="7"/>
         </w:numPr>
-        <w:rPr>
-          <w:lang w:val="en-PK"/>
-        </w:rPr>
-      </w:pPr>
-      <w:r>
-        <w:rPr>
-          <w:lang w:val="en-PK"/>
-        </w:rPr>
+      </w:pPr>
+      <w:r>
         <w:t>Budget allocation per department</w:t>
       </w:r>
     </w:p>
@@ -607,14 +429,8 @@
           <w:ilvl w:val="0"/>
           <w:numId w:val="7"/>
         </w:numPr>
-        <w:rPr>
-          <w:lang w:val="en-PK"/>
-        </w:rPr>
-      </w:pPr>
-      <w:r>
-        <w:rPr>
-          <w:lang w:val="en-PK"/>
-        </w:rPr>
+      </w:pPr>
+      <w:r>
         <w:t>Automated reorder point calculation</w:t>
       </w:r>
     </w:p>
@@ -623,14 +439,12 @@
         <w:rPr>
           <w:b/>
           <w:bCs/>
-          <w:lang w:val="en-PK"/>
         </w:rPr>
       </w:pPr>
       <w:r>
         <w:rPr>
           <w:b/>
           <w:bCs/>
-          <w:lang w:val="en-PK"/>
         </w:rPr>
         <w:t>Asset Management</w:t>
       </w:r>
@@ -641,14 +455,8 @@
           <w:ilvl w:val="0"/>
           <w:numId w:val="8"/>
         </w:numPr>
-        <w:rPr>
-          <w:lang w:val="en-PK"/>
-        </w:rPr>
-      </w:pPr>
-      <w:r>
-        <w:rPr>
-          <w:lang w:val="en-PK"/>
-        </w:rPr>
+      </w:pPr>
+      <w:r>
         <w:t>Asset tracking (e.g., IT equipment, furniture)</w:t>
       </w:r>
     </w:p>
@@ -658,14 +466,8 @@
           <w:ilvl w:val="0"/>
           <w:numId w:val="8"/>
         </w:numPr>
-        <w:rPr>
-          <w:lang w:val="en-PK"/>
-        </w:rPr>
-      </w:pPr>
-      <w:r>
-        <w:rPr>
-          <w:lang w:val="en-PK"/>
-        </w:rPr>
+      </w:pPr>
+      <w:r>
         <w:t>Assign assets to employees/departments</w:t>
       </w:r>
     </w:p>
@@ -675,14 +477,8 @@
           <w:ilvl w:val="0"/>
           <w:numId w:val="8"/>
         </w:numPr>
-        <w:rPr>
-          <w:lang w:val="en-PK"/>
-        </w:rPr>
-      </w:pPr>
-      <w:r>
-        <w:rPr>
-          <w:lang w:val="en-PK"/>
-        </w:rPr>
+      </w:pPr>
+      <w:r>
         <w:t>Maintenance schedules for assets</w:t>
       </w:r>
     </w:p>
@@ -692,14 +488,8 @@
           <w:ilvl w:val="0"/>
           <w:numId w:val="8"/>
         </w:numPr>
-        <w:rPr>
-          <w:lang w:val="en-PK"/>
-        </w:rPr>
-      </w:pPr>
-      <w:r>
-        <w:rPr>
-          <w:lang w:val="en-PK"/>
-        </w:rPr>
+      </w:pPr>
+      <w:r>
         <w:t>Depreciation tracking</w:t>
       </w:r>
     </w:p>
@@ -708,14 +498,12 @@
         <w:rPr>
           <w:b/>
           <w:bCs/>
-          <w:lang w:val="en-PK"/>
         </w:rPr>
       </w:pPr>
       <w:r>
         <w:rPr>
           <w:b/>
           <w:bCs/>
-          <w:lang w:val="en-PK"/>
         </w:rPr>
         <w:t>Reporting and Insights</w:t>
       </w:r>
@@ -726,14 +514,8 @@
           <w:ilvl w:val="0"/>
           <w:numId w:val="9"/>
         </w:numPr>
-        <w:rPr>
-          <w:lang w:val="en-PK"/>
-        </w:rPr>
-      </w:pPr>
-      <w:r>
-        <w:rPr>
-          <w:lang w:val="en-PK"/>
-        </w:rPr>
+      </w:pPr>
+      <w:r>
         <w:t>Inventory turnover reports</w:t>
       </w:r>
     </w:p>
@@ -743,14 +525,8 @@
           <w:ilvl w:val="0"/>
           <w:numId w:val="9"/>
         </w:numPr>
-        <w:rPr>
-          <w:lang w:val="en-PK"/>
-        </w:rPr>
-      </w:pPr>
-      <w:r>
-        <w:rPr>
-          <w:lang w:val="en-PK"/>
-        </w:rPr>
+      </w:pPr>
+      <w:r>
         <w:t>Purchase cost analysis</w:t>
       </w:r>
     </w:p>
@@ -760,14 +536,8 @@
           <w:ilvl w:val="0"/>
           <w:numId w:val="9"/>
         </w:numPr>
-        <w:rPr>
-          <w:lang w:val="en-PK"/>
-        </w:rPr>
-      </w:pPr>
-      <w:r>
-        <w:rPr>
-          <w:lang w:val="en-PK"/>
-        </w:rPr>
+      </w:pPr>
+      <w:r>
         <w:t>Consumption trend analysis</w:t>
       </w:r>
     </w:p>
@@ -776,14 +546,12 @@
         <w:rPr>
           <w:b/>
           <w:bCs/>
-          <w:lang w:val="en-PK"/>
         </w:rPr>
       </w:pPr>
       <w:r>
         <w:rPr>
           <w:b/>
           <w:bCs/>
-          <w:lang w:val="en-PK"/>
         </w:rPr>
         <w:t>Integration</w:t>
       </w:r>
@@ -794,14 +562,8 @@
           <w:ilvl w:val="0"/>
           <w:numId w:val="10"/>
         </w:numPr>
-        <w:rPr>
-          <w:lang w:val="en-PK"/>
-        </w:rPr>
-      </w:pPr>
-      <w:r>
-        <w:rPr>
-          <w:lang w:val="en-PK"/>
-        </w:rPr>
+      </w:pPr>
+      <w:r>
         <w:t>API integration with accounting tools (e.g., QuickBooks, Tally)</w:t>
       </w:r>
     </w:p>
@@ -811,14 +573,8 @@
           <w:ilvl w:val="0"/>
           <w:numId w:val="10"/>
         </w:numPr>
-        <w:rPr>
-          <w:lang w:val="en-PK"/>
-        </w:rPr>
-      </w:pPr>
-      <w:r>
-        <w:rPr>
-          <w:lang w:val="en-PK"/>
-        </w:rPr>
+      </w:pPr>
+      <w:r>
         <w:t>Integration with HR systems for department alignment</w:t>
       </w:r>
     </w:p>
@@ -827,14 +583,12 @@
         <w:rPr>
           <w:b/>
           <w:bCs/>
-          <w:lang w:val="en-PK"/>
         </w:rPr>
       </w:pPr>
       <w:r>
         <w:rPr>
           <w:b/>
           <w:bCs/>
-          <w:lang w:val="en-PK"/>
         </w:rPr>
         <w:t>User Management</w:t>
       </w:r>
@@ -845,14 +599,8 @@
           <w:ilvl w:val="0"/>
           <w:numId w:val="11"/>
         </w:numPr>
-        <w:rPr>
-          <w:lang w:val="en-PK"/>
-        </w:rPr>
-      </w:pPr>
-      <w:r>
-        <w:rPr>
-          <w:lang w:val="en-PK"/>
-        </w:rPr>
+      </w:pPr>
+      <w:r>
         <w:t>Detailed audit logs for user activities</w:t>
       </w:r>
     </w:p>
@@ -862,14 +610,8 @@
           <w:ilvl w:val="0"/>
           <w:numId w:val="11"/>
         </w:numPr>
-        <w:rPr>
-          <w:lang w:val="en-PK"/>
-        </w:rPr>
-      </w:pPr>
-      <w:r>
-        <w:rPr>
-          <w:lang w:val="en-PK"/>
-        </w:rPr>
+      </w:pPr>
+      <w:r>
         <w:t>Role-based access control</w:t>
       </w:r>
     </w:p>
@@ -3163,6 +2905,7 @@
   <w:style w:type="character" w:default="1" w:styleId="DefaultParagraphFont">
     <w:name w:val="Default Paragraph Font"/>
     <w:uiPriority w:val="1"/>
+    <w:semiHidden/>
     <w:unhideWhenUsed/>
   </w:style>
   <w:style w:type="table" w:default="1" w:styleId="TableNormal">

</xml_diff>

<commit_message>
Track stock levels (quantity in/out) Feature commit
</commit_message>
<xml_diff>
--- a/Document/Screen Document.docx
+++ b/Document/Screen Document.docx
@@ -7,18 +7,28 @@
         <w:rPr>
           <w:b/>
           <w:bCs/>
+          <w:lang/>
         </w:rPr>
       </w:pPr>
       <w:r>
         <w:rPr>
           <w:b/>
           <w:bCs/>
+          <w:lang/>
         </w:rPr>
         <w:t>1. Small Organization Features</w:t>
       </w:r>
     </w:p>
     <w:p>
-      <w:r>
+      <w:pPr>
+        <w:rPr>
+          <w:lang/>
+        </w:rPr>
+      </w:pPr>
+      <w:r>
+        <w:rPr>
+          <w:lang/>
+        </w:rPr>
         <w:t>These features focus on fundamental inventory management and operational efficiency.</w:t>
       </w:r>
     </w:p>
@@ -27,12 +37,14 @@
         <w:rPr>
           <w:b/>
           <w:bCs/>
+          <w:lang/>
         </w:rPr>
       </w:pPr>
       <w:r>
         <w:rPr>
           <w:b/>
           <w:bCs/>
+          <w:lang/>
         </w:rPr>
         <w:t>Inventory Management</w:t>
       </w:r>
@@ -43,8 +55,14 @@
           <w:ilvl w:val="0"/>
           <w:numId w:val="1"/>
         </w:numPr>
-      </w:pPr>
-      <w:r>
+        <w:rPr>
+          <w:lang/>
+        </w:rPr>
+      </w:pPr>
+      <w:r>
+        <w:rPr>
+          <w:lang/>
+        </w:rPr>
         <w:t>Add/Edit/Delete inventory items</w:t>
       </w:r>
     </w:p>
@@ -54,8 +72,14 @@
           <w:ilvl w:val="0"/>
           <w:numId w:val="1"/>
         </w:numPr>
-      </w:pPr>
-      <w:r>
+        <w:rPr>
+          <w:lang/>
+        </w:rPr>
+      </w:pPr>
+      <w:r>
+        <w:rPr>
+          <w:lang/>
+        </w:rPr>
         <w:t>Track stock levels (quantity in/out)</w:t>
       </w:r>
     </w:p>
@@ -65,8 +89,14 @@
           <w:ilvl w:val="0"/>
           <w:numId w:val="1"/>
         </w:numPr>
-      </w:pPr>
-      <w:r>
+        <w:rPr>
+          <w:lang/>
+        </w:rPr>
+      </w:pPr>
+      <w:r>
+        <w:rPr>
+          <w:lang/>
+        </w:rPr>
         <w:t>Categorize inventory (e.g., office supplies, IT equipment)</w:t>
       </w:r>
     </w:p>
@@ -76,8 +106,14 @@
           <w:ilvl w:val="0"/>
           <w:numId w:val="1"/>
         </w:numPr>
-      </w:pPr>
-      <w:r>
+        <w:rPr>
+          <w:lang/>
+        </w:rPr>
+      </w:pPr>
+      <w:r>
+        <w:rPr>
+          <w:lang/>
+        </w:rPr>
         <w:t>Barcode/QR code for inventory identification</w:t>
       </w:r>
     </w:p>
@@ -87,8 +123,14 @@
           <w:ilvl w:val="0"/>
           <w:numId w:val="1"/>
         </w:numPr>
-      </w:pPr>
-      <w:r>
+        <w:rPr>
+          <w:lang/>
+        </w:rPr>
+      </w:pPr>
+      <w:r>
+        <w:rPr>
+          <w:lang/>
+        </w:rPr>
         <w:t>Low stock alerts</w:t>
       </w:r>
     </w:p>
@@ -97,12 +139,14 @@
         <w:rPr>
           <w:b/>
           <w:bCs/>
+          <w:lang/>
         </w:rPr>
       </w:pPr>
       <w:r>
         <w:rPr>
           <w:b/>
           <w:bCs/>
+          <w:lang/>
         </w:rPr>
         <w:t>Purchase Management</w:t>
       </w:r>
@@ -113,8 +157,14 @@
           <w:ilvl w:val="0"/>
           <w:numId w:val="2"/>
         </w:numPr>
-      </w:pPr>
-      <w:r>
+        <w:rPr>
+          <w:lang/>
+        </w:rPr>
+      </w:pPr>
+      <w:r>
+        <w:rPr>
+          <w:lang/>
+        </w:rPr>
         <w:t>Raise purchase orders (PO)</w:t>
       </w:r>
     </w:p>
@@ -124,8 +174,14 @@
           <w:ilvl w:val="0"/>
           <w:numId w:val="2"/>
         </w:numPr>
-      </w:pPr>
-      <w:r>
+        <w:rPr>
+          <w:lang/>
+        </w:rPr>
+      </w:pPr>
+      <w:r>
+        <w:rPr>
+          <w:lang/>
+        </w:rPr>
         <w:t>Track PO statuses (pending, approved, received)</w:t>
       </w:r>
     </w:p>
@@ -135,8 +191,14 @@
           <w:ilvl w:val="0"/>
           <w:numId w:val="2"/>
         </w:numPr>
-      </w:pPr>
-      <w:r>
+        <w:rPr>
+          <w:lang/>
+        </w:rPr>
+      </w:pPr>
+      <w:r>
+        <w:rPr>
+          <w:lang/>
+        </w:rPr>
         <w:t>Simple supplier management (add/edit supplier details)</w:t>
       </w:r>
     </w:p>
@@ -146,8 +208,14 @@
           <w:ilvl w:val="0"/>
           <w:numId w:val="2"/>
         </w:numPr>
-      </w:pPr>
-      <w:r>
+        <w:rPr>
+          <w:lang/>
+        </w:rPr>
+      </w:pPr>
+      <w:r>
+        <w:rPr>
+          <w:lang/>
+        </w:rPr>
         <w:t>Invoice and receipt tracking</w:t>
       </w:r>
     </w:p>
@@ -156,12 +224,14 @@
         <w:rPr>
           <w:b/>
           <w:bCs/>
+          <w:lang/>
         </w:rPr>
       </w:pPr>
       <w:r>
         <w:rPr>
           <w:b/>
           <w:bCs/>
+          <w:lang/>
         </w:rPr>
         <w:t>Reporting</w:t>
       </w:r>
@@ -172,8 +242,14 @@
           <w:ilvl w:val="0"/>
           <w:numId w:val="3"/>
         </w:numPr>
-      </w:pPr>
-      <w:r>
+        <w:rPr>
+          <w:lang/>
+        </w:rPr>
+      </w:pPr>
+      <w:r>
+        <w:rPr>
+          <w:lang/>
+        </w:rPr>
         <w:t>Basic inventory reports (e.g., stock levels, purchase history)</w:t>
       </w:r>
     </w:p>
@@ -183,8 +259,14 @@
           <w:ilvl w:val="0"/>
           <w:numId w:val="3"/>
         </w:numPr>
-      </w:pPr>
-      <w:r>
+        <w:rPr>
+          <w:lang/>
+        </w:rPr>
+      </w:pPr>
+      <w:r>
+        <w:rPr>
+          <w:lang/>
+        </w:rPr>
         <w:t>Low stock and critical item alerts</w:t>
       </w:r>
     </w:p>
@@ -194,8 +276,14 @@
           <w:ilvl w:val="0"/>
           <w:numId w:val="3"/>
         </w:numPr>
-      </w:pPr>
-      <w:r>
+        <w:rPr>
+          <w:lang/>
+        </w:rPr>
+      </w:pPr>
+      <w:r>
+        <w:rPr>
+          <w:lang/>
+        </w:rPr>
         <w:t>Supplier performance summary</w:t>
       </w:r>
     </w:p>
@@ -204,12 +292,14 @@
         <w:rPr>
           <w:b/>
           <w:bCs/>
+          <w:lang/>
         </w:rPr>
       </w:pPr>
       <w:r>
         <w:rPr>
           <w:b/>
           <w:bCs/>
+          <w:lang/>
         </w:rPr>
         <w:t>User Management</w:t>
       </w:r>
@@ -220,8 +310,14 @@
           <w:ilvl w:val="0"/>
           <w:numId w:val="4"/>
         </w:numPr>
-      </w:pPr>
-      <w:r>
+        <w:rPr>
+          <w:lang/>
+        </w:rPr>
+      </w:pPr>
+      <w:r>
+        <w:rPr>
+          <w:lang/>
+        </w:rPr>
         <w:t>User roles and permissions (Admin, Employee)</w:t>
       </w:r>
     </w:p>
@@ -231,40 +327,121 @@
           <w:ilvl w:val="0"/>
           <w:numId w:val="4"/>
         </w:numPr>
-      </w:pPr>
-      <w:r>
+        <w:rPr>
+          <w:lang/>
+        </w:rPr>
+      </w:pPr>
+      <w:r>
+        <w:rPr>
+          <w:lang/>
+        </w:rPr>
         <w:t>Login and authentication</w:t>
       </w:r>
     </w:p>
-    <w:p/>
-    <w:p/>
-    <w:p/>
-    <w:p/>
-    <w:p/>
-    <w:p/>
-    <w:p/>
-    <w:p/>
-    <w:p/>
-    <w:p/>
-    <w:p/>
+    <w:p>
+      <w:pPr>
+        <w:rPr>
+          <w:lang/>
+        </w:rPr>
+      </w:pPr>
+    </w:p>
+    <w:p>
+      <w:pPr>
+        <w:rPr>
+          <w:lang/>
+        </w:rPr>
+      </w:pPr>
+    </w:p>
+    <w:p>
+      <w:pPr>
+        <w:rPr>
+          <w:lang/>
+        </w:rPr>
+      </w:pPr>
+    </w:p>
+    <w:p>
+      <w:pPr>
+        <w:rPr>
+          <w:lang/>
+        </w:rPr>
+      </w:pPr>
+    </w:p>
+    <w:p>
+      <w:pPr>
+        <w:rPr>
+          <w:lang/>
+        </w:rPr>
+      </w:pPr>
+    </w:p>
+    <w:p>
+      <w:pPr>
+        <w:rPr>
+          <w:lang/>
+        </w:rPr>
+      </w:pPr>
+    </w:p>
+    <w:p>
+      <w:pPr>
+        <w:rPr>
+          <w:lang/>
+        </w:rPr>
+      </w:pPr>
+    </w:p>
+    <w:p>
+      <w:pPr>
+        <w:rPr>
+          <w:lang/>
+        </w:rPr>
+      </w:pPr>
+    </w:p>
+    <w:p>
+      <w:pPr>
+        <w:rPr>
+          <w:lang/>
+        </w:rPr>
+      </w:pPr>
+    </w:p>
+    <w:p>
+      <w:pPr>
+        <w:rPr>
+          <w:lang/>
+        </w:rPr>
+      </w:pPr>
+    </w:p>
+    <w:p>
+      <w:pPr>
+        <w:rPr>
+          <w:lang/>
+        </w:rPr>
+      </w:pPr>
+    </w:p>
     <w:p>
       <w:pPr>
         <w:rPr>
           <w:b/>
           <w:bCs/>
+          <w:lang/>
         </w:rPr>
       </w:pPr>
       <w:r>
         <w:rPr>
           <w:b/>
           <w:bCs/>
-        </w:rPr>
-        <w:lastRenderedPageBreak/>
+          <w:lang/>
+        </w:rPr>
         <w:t>2. Medium Organization Features</w:t>
       </w:r>
     </w:p>
     <w:p>
-      <w:r>
+      <w:pPr>
+        <w:rPr>
+          <w:lang/>
+        </w:rPr>
+      </w:pPr>
+      <w:r>
+        <w:rPr>
+          <w:lang/>
+        </w:rPr>
         <w:t>These features accommodate more complex operations and scale.</w:t>
       </w:r>
     </w:p>
@@ -273,12 +450,14 @@
         <w:rPr>
           <w:b/>
           <w:bCs/>
+          <w:lang/>
         </w:rPr>
       </w:pPr>
       <w:r>
         <w:rPr>
           <w:b/>
           <w:bCs/>
+          <w:lang/>
         </w:rPr>
         <w:t>Advanced Inventory Management</w:t>
       </w:r>
@@ -289,8 +468,14 @@
           <w:ilvl w:val="0"/>
           <w:numId w:val="5"/>
         </w:numPr>
-      </w:pPr>
-      <w:r>
+        <w:rPr>
+          <w:lang/>
+        </w:rPr>
+      </w:pPr>
+      <w:r>
+        <w:rPr>
+          <w:lang/>
+        </w:rPr>
         <w:t>Batch/lot tracking</w:t>
       </w:r>
     </w:p>
@@ -300,8 +485,14 @@
           <w:ilvl w:val="0"/>
           <w:numId w:val="5"/>
         </w:numPr>
-      </w:pPr>
-      <w:r>
+        <w:rPr>
+          <w:lang/>
+        </w:rPr>
+      </w:pPr>
+      <w:r>
+        <w:rPr>
+          <w:lang/>
+        </w:rPr>
         <w:t>Inventory location tracking (warehouse, floor, department)</w:t>
       </w:r>
     </w:p>
@@ -311,8 +502,14 @@
           <w:ilvl w:val="0"/>
           <w:numId w:val="5"/>
         </w:numPr>
-      </w:pPr>
-      <w:r>
+        <w:rPr>
+          <w:lang/>
+        </w:rPr>
+      </w:pPr>
+      <w:r>
+        <w:rPr>
+          <w:lang/>
+        </w:rPr>
         <w:t>Stock valuation (FIFO, LIFO, Weighted Average)</w:t>
       </w:r>
     </w:p>
@@ -322,8 +519,14 @@
           <w:ilvl w:val="0"/>
           <w:numId w:val="5"/>
         </w:numPr>
-      </w:pPr>
-      <w:r>
+        <w:rPr>
+          <w:lang/>
+        </w:rPr>
+      </w:pPr>
+      <w:r>
+        <w:rPr>
+          <w:lang/>
+        </w:rPr>
         <w:t>Multi-category inventory handling</w:t>
       </w:r>
     </w:p>
@@ -333,8 +536,14 @@
           <w:ilvl w:val="0"/>
           <w:numId w:val="5"/>
         </w:numPr>
-      </w:pPr>
-      <w:r>
+        <w:rPr>
+          <w:lang/>
+        </w:rPr>
+      </w:pPr>
+      <w:r>
+        <w:rPr>
+          <w:lang/>
+        </w:rPr>
         <w:t>Expiry date tracking for perishable items</w:t>
       </w:r>
     </w:p>
@@ -343,12 +552,14 @@
         <w:rPr>
           <w:b/>
           <w:bCs/>
+          <w:lang/>
         </w:rPr>
       </w:pPr>
       <w:r>
         <w:rPr>
           <w:b/>
           <w:bCs/>
+          <w:lang/>
         </w:rPr>
         <w:t>Supplier and Vendor Management</w:t>
       </w:r>
@@ -359,8 +570,14 @@
           <w:ilvl w:val="0"/>
           <w:numId w:val="6"/>
         </w:numPr>
-      </w:pPr>
-      <w:r>
+        <w:rPr>
+          <w:lang/>
+        </w:rPr>
+      </w:pPr>
+      <w:r>
+        <w:rPr>
+          <w:lang/>
+        </w:rPr>
         <w:t>Supplier contracts and history</w:t>
       </w:r>
     </w:p>
@@ -370,8 +587,14 @@
           <w:ilvl w:val="0"/>
           <w:numId w:val="6"/>
         </w:numPr>
-      </w:pPr>
-      <w:r>
+        <w:rPr>
+          <w:lang/>
+        </w:rPr>
+      </w:pPr>
+      <w:r>
+        <w:rPr>
+          <w:lang/>
+        </w:rPr>
         <w:t>Manage multiple suppliers for the same item</w:t>
       </w:r>
     </w:p>
@@ -381,8 +604,14 @@
           <w:ilvl w:val="0"/>
           <w:numId w:val="6"/>
         </w:numPr>
-      </w:pPr>
-      <w:r>
+        <w:rPr>
+          <w:lang/>
+        </w:rPr>
+      </w:pPr>
+      <w:r>
+        <w:rPr>
+          <w:lang/>
+        </w:rPr>
         <w:t>Supplier performance metrics (e.g., delivery time, quality)</w:t>
       </w:r>
     </w:p>
@@ -391,12 +620,14 @@
         <w:rPr>
           <w:b/>
           <w:bCs/>
+          <w:lang/>
         </w:rPr>
       </w:pPr>
       <w:r>
         <w:rPr>
           <w:b/>
           <w:bCs/>
+          <w:lang/>
         </w:rPr>
         <w:t>Procurement Management</w:t>
       </w:r>
@@ -407,8 +638,14 @@
           <w:ilvl w:val="0"/>
           <w:numId w:val="7"/>
         </w:numPr>
-      </w:pPr>
-      <w:r>
+        <w:rPr>
+          <w:lang/>
+        </w:rPr>
+      </w:pPr>
+      <w:r>
+        <w:rPr>
+          <w:lang/>
+        </w:rPr>
         <w:t>Multi-level PO approval workflows</w:t>
       </w:r>
     </w:p>
@@ -418,8 +655,14 @@
           <w:ilvl w:val="0"/>
           <w:numId w:val="7"/>
         </w:numPr>
-      </w:pPr>
-      <w:r>
+        <w:rPr>
+          <w:lang/>
+        </w:rPr>
+      </w:pPr>
+      <w:r>
+        <w:rPr>
+          <w:lang/>
+        </w:rPr>
         <w:t>Budget allocation per department</w:t>
       </w:r>
     </w:p>
@@ -429,8 +672,14 @@
           <w:ilvl w:val="0"/>
           <w:numId w:val="7"/>
         </w:numPr>
-      </w:pPr>
-      <w:r>
+        <w:rPr>
+          <w:lang/>
+        </w:rPr>
+      </w:pPr>
+      <w:r>
+        <w:rPr>
+          <w:lang/>
+        </w:rPr>
         <w:t>Automated reorder point calculation</w:t>
       </w:r>
     </w:p>
@@ -439,12 +688,14 @@
         <w:rPr>
           <w:b/>
           <w:bCs/>
+          <w:lang/>
         </w:rPr>
       </w:pPr>
       <w:r>
         <w:rPr>
           <w:b/>
           <w:bCs/>
+          <w:lang/>
         </w:rPr>
         <w:t>Asset Management</w:t>
       </w:r>
@@ -455,8 +706,14 @@
           <w:ilvl w:val="0"/>
           <w:numId w:val="8"/>
         </w:numPr>
-      </w:pPr>
-      <w:r>
+        <w:rPr>
+          <w:lang/>
+        </w:rPr>
+      </w:pPr>
+      <w:r>
+        <w:rPr>
+          <w:lang/>
+        </w:rPr>
         <w:t>Asset tracking (e.g., IT equipment, furniture)</w:t>
       </w:r>
     </w:p>
@@ -466,8 +723,14 @@
           <w:ilvl w:val="0"/>
           <w:numId w:val="8"/>
         </w:numPr>
-      </w:pPr>
-      <w:r>
+        <w:rPr>
+          <w:lang/>
+        </w:rPr>
+      </w:pPr>
+      <w:r>
+        <w:rPr>
+          <w:lang/>
+        </w:rPr>
         <w:t>Assign assets to employees/departments</w:t>
       </w:r>
     </w:p>
@@ -477,8 +740,14 @@
           <w:ilvl w:val="0"/>
           <w:numId w:val="8"/>
         </w:numPr>
-      </w:pPr>
-      <w:r>
+        <w:rPr>
+          <w:lang/>
+        </w:rPr>
+      </w:pPr>
+      <w:r>
+        <w:rPr>
+          <w:lang/>
+        </w:rPr>
         <w:t>Maintenance schedules for assets</w:t>
       </w:r>
     </w:p>
@@ -488,8 +757,14 @@
           <w:ilvl w:val="0"/>
           <w:numId w:val="8"/>
         </w:numPr>
-      </w:pPr>
-      <w:r>
+        <w:rPr>
+          <w:lang/>
+        </w:rPr>
+      </w:pPr>
+      <w:r>
+        <w:rPr>
+          <w:lang/>
+        </w:rPr>
         <w:t>Depreciation tracking</w:t>
       </w:r>
     </w:p>
@@ -498,12 +773,14 @@
         <w:rPr>
           <w:b/>
           <w:bCs/>
+          <w:lang/>
         </w:rPr>
       </w:pPr>
       <w:r>
         <w:rPr>
           <w:b/>
           <w:bCs/>
+          <w:lang/>
         </w:rPr>
         <w:t>Reporting and Insights</w:t>
       </w:r>
@@ -514,8 +791,14 @@
           <w:ilvl w:val="0"/>
           <w:numId w:val="9"/>
         </w:numPr>
-      </w:pPr>
-      <w:r>
+        <w:rPr>
+          <w:lang/>
+        </w:rPr>
+      </w:pPr>
+      <w:r>
+        <w:rPr>
+          <w:lang/>
+        </w:rPr>
         <w:t>Inventory turnover reports</w:t>
       </w:r>
     </w:p>
@@ -525,8 +808,14 @@
           <w:ilvl w:val="0"/>
           <w:numId w:val="9"/>
         </w:numPr>
-      </w:pPr>
-      <w:r>
+        <w:rPr>
+          <w:lang/>
+        </w:rPr>
+      </w:pPr>
+      <w:r>
+        <w:rPr>
+          <w:lang/>
+        </w:rPr>
         <w:t>Purchase cost analysis</w:t>
       </w:r>
     </w:p>
@@ -536,8 +825,14 @@
           <w:ilvl w:val="0"/>
           <w:numId w:val="9"/>
         </w:numPr>
-      </w:pPr>
-      <w:r>
+        <w:rPr>
+          <w:lang/>
+        </w:rPr>
+      </w:pPr>
+      <w:r>
+        <w:rPr>
+          <w:lang/>
+        </w:rPr>
         <w:t>Consumption trend analysis</w:t>
       </w:r>
     </w:p>
@@ -546,12 +841,14 @@
         <w:rPr>
           <w:b/>
           <w:bCs/>
+          <w:lang/>
         </w:rPr>
       </w:pPr>
       <w:r>
         <w:rPr>
           <w:b/>
           <w:bCs/>
+          <w:lang/>
         </w:rPr>
         <w:t>Integration</w:t>
       </w:r>
@@ -562,8 +859,14 @@
           <w:ilvl w:val="0"/>
           <w:numId w:val="10"/>
         </w:numPr>
-      </w:pPr>
-      <w:r>
+        <w:rPr>
+          <w:lang/>
+        </w:rPr>
+      </w:pPr>
+      <w:r>
+        <w:rPr>
+          <w:lang/>
+        </w:rPr>
         <w:t>API integration with accounting tools (e.g., QuickBooks, Tally)</w:t>
       </w:r>
     </w:p>
@@ -573,8 +876,15 @@
           <w:ilvl w:val="0"/>
           <w:numId w:val="10"/>
         </w:numPr>
-      </w:pPr>
-      <w:r>
+        <w:rPr>
+          <w:lang/>
+        </w:rPr>
+      </w:pPr>
+      <w:r>
+        <w:rPr>
+          <w:lang/>
+        </w:rPr>
+        <w:lastRenderedPageBreak/>
         <w:t>Integration with HR systems for department alignment</w:t>
       </w:r>
     </w:p>
@@ -583,12 +893,14 @@
         <w:rPr>
           <w:b/>
           <w:bCs/>
+          <w:lang/>
         </w:rPr>
       </w:pPr>
       <w:r>
         <w:rPr>
           <w:b/>
           <w:bCs/>
+          <w:lang/>
         </w:rPr>
         <w:t>User Management</w:t>
       </w:r>
@@ -599,8 +911,14 @@
           <w:ilvl w:val="0"/>
           <w:numId w:val="11"/>
         </w:numPr>
-      </w:pPr>
-      <w:r>
+        <w:rPr>
+          <w:lang/>
+        </w:rPr>
+      </w:pPr>
+      <w:r>
+        <w:rPr>
+          <w:lang/>
+        </w:rPr>
         <w:t>Detailed audit logs for user activities</w:t>
       </w:r>
     </w:p>
@@ -610,15 +928,22 @@
           <w:ilvl w:val="0"/>
           <w:numId w:val="11"/>
         </w:numPr>
-      </w:pPr>
-      <w:r>
+        <w:rPr>
+          <w:lang/>
+        </w:rPr>
+      </w:pPr>
+      <w:r>
+        <w:rPr>
+          <w:lang/>
+        </w:rPr>
         <w:t>Role-based access control</w:t>
       </w:r>
     </w:p>
+    <w:p/>
     <w:sectPr>
-      <w:pgSz w:w="11906" w:h="16838"/>
-      <w:pgMar w:top="1440" w:right="1440" w:bottom="1440" w:left="1440" w:header="708" w:footer="708" w:gutter="0"/>
-      <w:cols w:space="708"/>
+      <w:pgSz w:w="12240" w:h="15840"/>
+      <w:pgMar w:top="1440" w:right="1440" w:bottom="1440" w:left="1440" w:header="720" w:footer="720" w:gutter="0"/>
+      <w:cols w:space="720"/>
       <w:docGrid w:linePitch="360"/>
     </w:sectPr>
   </w:body>
@@ -647,7 +972,7 @@
         <w:sz w:val="20"/>
       </w:rPr>
     </w:lvl>
-    <w:lvl w:ilvl="1" w:tentative="1">
+    <w:lvl w:ilvl="1">
       <w:start w:val="1"/>
       <w:numFmt w:val="bullet"/>
       <w:lvlText w:val="o"/>
@@ -659,11 +984,11 @@
         <w:ind w:left="1440" w:hanging="360"/>
       </w:pPr>
       <w:rPr>
-        <w:rFonts w:ascii="Courier New" w:hAnsi="Courier New" w:hint="default"/>
-        <w:sz w:val="20"/>
-      </w:rPr>
-    </w:lvl>
-    <w:lvl w:ilvl="2" w:tentative="1">
+        <w:rFonts w:ascii="Courier New" w:hAnsi="Courier New" w:cs="Times New Roman" w:hint="default"/>
+        <w:sz w:val="20"/>
+      </w:rPr>
+    </w:lvl>
+    <w:lvl w:ilvl="2">
       <w:start w:val="1"/>
       <w:numFmt w:val="bullet"/>
       <w:lvlText w:val=""/>
@@ -679,7 +1004,7 @@
         <w:sz w:val="20"/>
       </w:rPr>
     </w:lvl>
-    <w:lvl w:ilvl="3" w:tentative="1">
+    <w:lvl w:ilvl="3">
       <w:start w:val="1"/>
       <w:numFmt w:val="bullet"/>
       <w:lvlText w:val=""/>
@@ -695,7 +1020,7 @@
         <w:sz w:val="20"/>
       </w:rPr>
     </w:lvl>
-    <w:lvl w:ilvl="4" w:tentative="1">
+    <w:lvl w:ilvl="4">
       <w:start w:val="1"/>
       <w:numFmt w:val="bullet"/>
       <w:lvlText w:val=""/>
@@ -711,7 +1036,7 @@
         <w:sz w:val="20"/>
       </w:rPr>
     </w:lvl>
-    <w:lvl w:ilvl="5" w:tentative="1">
+    <w:lvl w:ilvl="5">
       <w:start w:val="1"/>
       <w:numFmt w:val="bullet"/>
       <w:lvlText w:val=""/>
@@ -727,7 +1052,7 @@
         <w:sz w:val="20"/>
       </w:rPr>
     </w:lvl>
-    <w:lvl w:ilvl="6" w:tentative="1">
+    <w:lvl w:ilvl="6">
       <w:start w:val="1"/>
       <w:numFmt w:val="bullet"/>
       <w:lvlText w:val=""/>
@@ -743,7 +1068,7 @@
         <w:sz w:val="20"/>
       </w:rPr>
     </w:lvl>
-    <w:lvl w:ilvl="7" w:tentative="1">
+    <w:lvl w:ilvl="7">
       <w:start w:val="1"/>
       <w:numFmt w:val="bullet"/>
       <w:lvlText w:val=""/>
@@ -759,7 +1084,7 @@
         <w:sz w:val="20"/>
       </w:rPr>
     </w:lvl>
-    <w:lvl w:ilvl="8" w:tentative="1">
+    <w:lvl w:ilvl="8">
       <w:start w:val="1"/>
       <w:numFmt w:val="bullet"/>
       <w:lvlText w:val=""/>
@@ -796,7 +1121,7 @@
         <w:sz w:val="20"/>
       </w:rPr>
     </w:lvl>
-    <w:lvl w:ilvl="1" w:tentative="1">
+    <w:lvl w:ilvl="1">
       <w:start w:val="1"/>
       <w:numFmt w:val="bullet"/>
       <w:lvlText w:val="o"/>
@@ -808,11 +1133,11 @@
         <w:ind w:left="1440" w:hanging="360"/>
       </w:pPr>
       <w:rPr>
-        <w:rFonts w:ascii="Courier New" w:hAnsi="Courier New" w:hint="default"/>
-        <w:sz w:val="20"/>
-      </w:rPr>
-    </w:lvl>
-    <w:lvl w:ilvl="2" w:tentative="1">
+        <w:rFonts w:ascii="Courier New" w:hAnsi="Courier New" w:cs="Times New Roman" w:hint="default"/>
+        <w:sz w:val="20"/>
+      </w:rPr>
+    </w:lvl>
+    <w:lvl w:ilvl="2">
       <w:start w:val="1"/>
       <w:numFmt w:val="bullet"/>
       <w:lvlText w:val=""/>
@@ -828,7 +1153,7 @@
         <w:sz w:val="20"/>
       </w:rPr>
     </w:lvl>
-    <w:lvl w:ilvl="3" w:tentative="1">
+    <w:lvl w:ilvl="3">
       <w:start w:val="1"/>
       <w:numFmt w:val="bullet"/>
       <w:lvlText w:val=""/>
@@ -844,7 +1169,7 @@
         <w:sz w:val="20"/>
       </w:rPr>
     </w:lvl>
-    <w:lvl w:ilvl="4" w:tentative="1">
+    <w:lvl w:ilvl="4">
       <w:start w:val="1"/>
       <w:numFmt w:val="bullet"/>
       <w:lvlText w:val=""/>
@@ -860,7 +1185,7 @@
         <w:sz w:val="20"/>
       </w:rPr>
     </w:lvl>
-    <w:lvl w:ilvl="5" w:tentative="1">
+    <w:lvl w:ilvl="5">
       <w:start w:val="1"/>
       <w:numFmt w:val="bullet"/>
       <w:lvlText w:val=""/>
@@ -876,7 +1201,7 @@
         <w:sz w:val="20"/>
       </w:rPr>
     </w:lvl>
-    <w:lvl w:ilvl="6" w:tentative="1">
+    <w:lvl w:ilvl="6">
       <w:start w:val="1"/>
       <w:numFmt w:val="bullet"/>
       <w:lvlText w:val=""/>
@@ -892,7 +1217,7 @@
         <w:sz w:val="20"/>
       </w:rPr>
     </w:lvl>
-    <w:lvl w:ilvl="7" w:tentative="1">
+    <w:lvl w:ilvl="7">
       <w:start w:val="1"/>
       <w:numFmt w:val="bullet"/>
       <w:lvlText w:val=""/>
@@ -908,7 +1233,7 @@
         <w:sz w:val="20"/>
       </w:rPr>
     </w:lvl>
-    <w:lvl w:ilvl="8" w:tentative="1">
+    <w:lvl w:ilvl="8">
       <w:start w:val="1"/>
       <w:numFmt w:val="bullet"/>
       <w:lvlText w:val=""/>
@@ -945,7 +1270,7 @@
         <w:sz w:val="20"/>
       </w:rPr>
     </w:lvl>
-    <w:lvl w:ilvl="1" w:tentative="1">
+    <w:lvl w:ilvl="1">
       <w:start w:val="1"/>
       <w:numFmt w:val="bullet"/>
       <w:lvlText w:val="o"/>
@@ -957,11 +1282,11 @@
         <w:ind w:left="1440" w:hanging="360"/>
       </w:pPr>
       <w:rPr>
-        <w:rFonts w:ascii="Courier New" w:hAnsi="Courier New" w:hint="default"/>
-        <w:sz w:val="20"/>
-      </w:rPr>
-    </w:lvl>
-    <w:lvl w:ilvl="2" w:tentative="1">
+        <w:rFonts w:ascii="Courier New" w:hAnsi="Courier New" w:cs="Times New Roman" w:hint="default"/>
+        <w:sz w:val="20"/>
+      </w:rPr>
+    </w:lvl>
+    <w:lvl w:ilvl="2">
       <w:start w:val="1"/>
       <w:numFmt w:val="bullet"/>
       <w:lvlText w:val=""/>
@@ -977,7 +1302,7 @@
         <w:sz w:val="20"/>
       </w:rPr>
     </w:lvl>
-    <w:lvl w:ilvl="3" w:tentative="1">
+    <w:lvl w:ilvl="3">
       <w:start w:val="1"/>
       <w:numFmt w:val="bullet"/>
       <w:lvlText w:val=""/>
@@ -993,7 +1318,7 @@
         <w:sz w:val="20"/>
       </w:rPr>
     </w:lvl>
-    <w:lvl w:ilvl="4" w:tentative="1">
+    <w:lvl w:ilvl="4">
       <w:start w:val="1"/>
       <w:numFmt w:val="bullet"/>
       <w:lvlText w:val=""/>
@@ -1009,7 +1334,7 @@
         <w:sz w:val="20"/>
       </w:rPr>
     </w:lvl>
-    <w:lvl w:ilvl="5" w:tentative="1">
+    <w:lvl w:ilvl="5">
       <w:start w:val="1"/>
       <w:numFmt w:val="bullet"/>
       <w:lvlText w:val=""/>
@@ -1025,7 +1350,7 @@
         <w:sz w:val="20"/>
       </w:rPr>
     </w:lvl>
-    <w:lvl w:ilvl="6" w:tentative="1">
+    <w:lvl w:ilvl="6">
       <w:start w:val="1"/>
       <w:numFmt w:val="bullet"/>
       <w:lvlText w:val=""/>
@@ -1041,7 +1366,7 @@
         <w:sz w:val="20"/>
       </w:rPr>
     </w:lvl>
-    <w:lvl w:ilvl="7" w:tentative="1">
+    <w:lvl w:ilvl="7">
       <w:start w:val="1"/>
       <w:numFmt w:val="bullet"/>
       <w:lvlText w:val=""/>
@@ -1057,7 +1382,7 @@
         <w:sz w:val="20"/>
       </w:rPr>
     </w:lvl>
-    <w:lvl w:ilvl="8" w:tentative="1">
+    <w:lvl w:ilvl="8">
       <w:start w:val="1"/>
       <w:numFmt w:val="bullet"/>
       <w:lvlText w:val=""/>
@@ -1094,7 +1419,7 @@
         <w:sz w:val="20"/>
       </w:rPr>
     </w:lvl>
-    <w:lvl w:ilvl="1" w:tentative="1">
+    <w:lvl w:ilvl="1">
       <w:start w:val="1"/>
       <w:numFmt w:val="bullet"/>
       <w:lvlText w:val="o"/>
@@ -1106,11 +1431,11 @@
         <w:ind w:left="1440" w:hanging="360"/>
       </w:pPr>
       <w:rPr>
-        <w:rFonts w:ascii="Courier New" w:hAnsi="Courier New" w:hint="default"/>
-        <w:sz w:val="20"/>
-      </w:rPr>
-    </w:lvl>
-    <w:lvl w:ilvl="2" w:tentative="1">
+        <w:rFonts w:ascii="Courier New" w:hAnsi="Courier New" w:cs="Times New Roman" w:hint="default"/>
+        <w:sz w:val="20"/>
+      </w:rPr>
+    </w:lvl>
+    <w:lvl w:ilvl="2">
       <w:start w:val="1"/>
       <w:numFmt w:val="bullet"/>
       <w:lvlText w:val=""/>
@@ -1126,7 +1451,7 @@
         <w:sz w:val="20"/>
       </w:rPr>
     </w:lvl>
-    <w:lvl w:ilvl="3" w:tentative="1">
+    <w:lvl w:ilvl="3">
       <w:start w:val="1"/>
       <w:numFmt w:val="bullet"/>
       <w:lvlText w:val=""/>
@@ -1142,7 +1467,7 @@
         <w:sz w:val="20"/>
       </w:rPr>
     </w:lvl>
-    <w:lvl w:ilvl="4" w:tentative="1">
+    <w:lvl w:ilvl="4">
       <w:start w:val="1"/>
       <w:numFmt w:val="bullet"/>
       <w:lvlText w:val=""/>
@@ -1158,7 +1483,7 @@
         <w:sz w:val="20"/>
       </w:rPr>
     </w:lvl>
-    <w:lvl w:ilvl="5" w:tentative="1">
+    <w:lvl w:ilvl="5">
       <w:start w:val="1"/>
       <w:numFmt w:val="bullet"/>
       <w:lvlText w:val=""/>
@@ -1174,7 +1499,7 @@
         <w:sz w:val="20"/>
       </w:rPr>
     </w:lvl>
-    <w:lvl w:ilvl="6" w:tentative="1">
+    <w:lvl w:ilvl="6">
       <w:start w:val="1"/>
       <w:numFmt w:val="bullet"/>
       <w:lvlText w:val=""/>
@@ -1190,7 +1515,7 @@
         <w:sz w:val="20"/>
       </w:rPr>
     </w:lvl>
-    <w:lvl w:ilvl="7" w:tentative="1">
+    <w:lvl w:ilvl="7">
       <w:start w:val="1"/>
       <w:numFmt w:val="bullet"/>
       <w:lvlText w:val=""/>
@@ -1206,7 +1531,7 @@
         <w:sz w:val="20"/>
       </w:rPr>
     </w:lvl>
-    <w:lvl w:ilvl="8" w:tentative="1">
+    <w:lvl w:ilvl="8">
       <w:start w:val="1"/>
       <w:numFmt w:val="bullet"/>
       <w:lvlText w:val=""/>
@@ -1243,7 +1568,7 @@
         <w:sz w:val="20"/>
       </w:rPr>
     </w:lvl>
-    <w:lvl w:ilvl="1" w:tentative="1">
+    <w:lvl w:ilvl="1">
       <w:start w:val="1"/>
       <w:numFmt w:val="bullet"/>
       <w:lvlText w:val="o"/>
@@ -1255,11 +1580,11 @@
         <w:ind w:left="1440" w:hanging="360"/>
       </w:pPr>
       <w:rPr>
-        <w:rFonts w:ascii="Courier New" w:hAnsi="Courier New" w:hint="default"/>
-        <w:sz w:val="20"/>
-      </w:rPr>
-    </w:lvl>
-    <w:lvl w:ilvl="2" w:tentative="1">
+        <w:rFonts w:ascii="Courier New" w:hAnsi="Courier New" w:cs="Times New Roman" w:hint="default"/>
+        <w:sz w:val="20"/>
+      </w:rPr>
+    </w:lvl>
+    <w:lvl w:ilvl="2">
       <w:start w:val="1"/>
       <w:numFmt w:val="bullet"/>
       <w:lvlText w:val=""/>
@@ -1275,7 +1600,7 @@
         <w:sz w:val="20"/>
       </w:rPr>
     </w:lvl>
-    <w:lvl w:ilvl="3" w:tentative="1">
+    <w:lvl w:ilvl="3">
       <w:start w:val="1"/>
       <w:numFmt w:val="bullet"/>
       <w:lvlText w:val=""/>
@@ -1291,7 +1616,7 @@
         <w:sz w:val="20"/>
       </w:rPr>
     </w:lvl>
-    <w:lvl w:ilvl="4" w:tentative="1">
+    <w:lvl w:ilvl="4">
       <w:start w:val="1"/>
       <w:numFmt w:val="bullet"/>
       <w:lvlText w:val=""/>
@@ -1307,7 +1632,7 @@
         <w:sz w:val="20"/>
       </w:rPr>
     </w:lvl>
-    <w:lvl w:ilvl="5" w:tentative="1">
+    <w:lvl w:ilvl="5">
       <w:start w:val="1"/>
       <w:numFmt w:val="bullet"/>
       <w:lvlText w:val=""/>
@@ -1323,7 +1648,7 @@
         <w:sz w:val="20"/>
       </w:rPr>
     </w:lvl>
-    <w:lvl w:ilvl="6" w:tentative="1">
+    <w:lvl w:ilvl="6">
       <w:start w:val="1"/>
       <w:numFmt w:val="bullet"/>
       <w:lvlText w:val=""/>
@@ -1339,7 +1664,7 @@
         <w:sz w:val="20"/>
       </w:rPr>
     </w:lvl>
-    <w:lvl w:ilvl="7" w:tentative="1">
+    <w:lvl w:ilvl="7">
       <w:start w:val="1"/>
       <w:numFmt w:val="bullet"/>
       <w:lvlText w:val=""/>
@@ -1355,7 +1680,7 @@
         <w:sz w:val="20"/>
       </w:rPr>
     </w:lvl>
-    <w:lvl w:ilvl="8" w:tentative="1">
+    <w:lvl w:ilvl="8">
       <w:start w:val="1"/>
       <w:numFmt w:val="bullet"/>
       <w:lvlText w:val=""/>
@@ -1392,7 +1717,7 @@
         <w:sz w:val="20"/>
       </w:rPr>
     </w:lvl>
-    <w:lvl w:ilvl="1" w:tentative="1">
+    <w:lvl w:ilvl="1">
       <w:start w:val="1"/>
       <w:numFmt w:val="bullet"/>
       <w:lvlText w:val="o"/>
@@ -1404,11 +1729,11 @@
         <w:ind w:left="1440" w:hanging="360"/>
       </w:pPr>
       <w:rPr>
-        <w:rFonts w:ascii="Courier New" w:hAnsi="Courier New" w:hint="default"/>
-        <w:sz w:val="20"/>
-      </w:rPr>
-    </w:lvl>
-    <w:lvl w:ilvl="2" w:tentative="1">
+        <w:rFonts w:ascii="Courier New" w:hAnsi="Courier New" w:cs="Times New Roman" w:hint="default"/>
+        <w:sz w:val="20"/>
+      </w:rPr>
+    </w:lvl>
+    <w:lvl w:ilvl="2">
       <w:start w:val="1"/>
       <w:numFmt w:val="bullet"/>
       <w:lvlText w:val=""/>
@@ -1424,7 +1749,7 @@
         <w:sz w:val="20"/>
       </w:rPr>
     </w:lvl>
-    <w:lvl w:ilvl="3" w:tentative="1">
+    <w:lvl w:ilvl="3">
       <w:start w:val="1"/>
       <w:numFmt w:val="bullet"/>
       <w:lvlText w:val=""/>
@@ -1440,7 +1765,7 @@
         <w:sz w:val="20"/>
       </w:rPr>
     </w:lvl>
-    <w:lvl w:ilvl="4" w:tentative="1">
+    <w:lvl w:ilvl="4">
       <w:start w:val="1"/>
       <w:numFmt w:val="bullet"/>
       <w:lvlText w:val=""/>
@@ -1456,7 +1781,7 @@
         <w:sz w:val="20"/>
       </w:rPr>
     </w:lvl>
-    <w:lvl w:ilvl="5" w:tentative="1">
+    <w:lvl w:ilvl="5">
       <w:start w:val="1"/>
       <w:numFmt w:val="bullet"/>
       <w:lvlText w:val=""/>
@@ -1472,7 +1797,7 @@
         <w:sz w:val="20"/>
       </w:rPr>
     </w:lvl>
-    <w:lvl w:ilvl="6" w:tentative="1">
+    <w:lvl w:ilvl="6">
       <w:start w:val="1"/>
       <w:numFmt w:val="bullet"/>
       <w:lvlText w:val=""/>
@@ -1488,7 +1813,7 @@
         <w:sz w:val="20"/>
       </w:rPr>
     </w:lvl>
-    <w:lvl w:ilvl="7" w:tentative="1">
+    <w:lvl w:ilvl="7">
       <w:start w:val="1"/>
       <w:numFmt w:val="bullet"/>
       <w:lvlText w:val=""/>
@@ -1504,7 +1829,7 @@
         <w:sz w:val="20"/>
       </w:rPr>
     </w:lvl>
-    <w:lvl w:ilvl="8" w:tentative="1">
+    <w:lvl w:ilvl="8">
       <w:start w:val="1"/>
       <w:numFmt w:val="bullet"/>
       <w:lvlText w:val=""/>
@@ -1541,7 +1866,7 @@
         <w:sz w:val="20"/>
       </w:rPr>
     </w:lvl>
-    <w:lvl w:ilvl="1" w:tentative="1">
+    <w:lvl w:ilvl="1">
       <w:start w:val="1"/>
       <w:numFmt w:val="bullet"/>
       <w:lvlText w:val="o"/>
@@ -1553,11 +1878,11 @@
         <w:ind w:left="1440" w:hanging="360"/>
       </w:pPr>
       <w:rPr>
-        <w:rFonts w:ascii="Courier New" w:hAnsi="Courier New" w:hint="default"/>
-        <w:sz w:val="20"/>
-      </w:rPr>
-    </w:lvl>
-    <w:lvl w:ilvl="2" w:tentative="1">
+        <w:rFonts w:ascii="Courier New" w:hAnsi="Courier New" w:cs="Times New Roman" w:hint="default"/>
+        <w:sz w:val="20"/>
+      </w:rPr>
+    </w:lvl>
+    <w:lvl w:ilvl="2">
       <w:start w:val="1"/>
       <w:numFmt w:val="bullet"/>
       <w:lvlText w:val=""/>
@@ -1573,7 +1898,7 @@
         <w:sz w:val="20"/>
       </w:rPr>
     </w:lvl>
-    <w:lvl w:ilvl="3" w:tentative="1">
+    <w:lvl w:ilvl="3">
       <w:start w:val="1"/>
       <w:numFmt w:val="bullet"/>
       <w:lvlText w:val=""/>
@@ -1589,7 +1914,7 @@
         <w:sz w:val="20"/>
       </w:rPr>
     </w:lvl>
-    <w:lvl w:ilvl="4" w:tentative="1">
+    <w:lvl w:ilvl="4">
       <w:start w:val="1"/>
       <w:numFmt w:val="bullet"/>
       <w:lvlText w:val=""/>
@@ -1605,7 +1930,7 @@
         <w:sz w:val="20"/>
       </w:rPr>
     </w:lvl>
-    <w:lvl w:ilvl="5" w:tentative="1">
+    <w:lvl w:ilvl="5">
       <w:start w:val="1"/>
       <w:numFmt w:val="bullet"/>
       <w:lvlText w:val=""/>
@@ -1621,7 +1946,7 @@
         <w:sz w:val="20"/>
       </w:rPr>
     </w:lvl>
-    <w:lvl w:ilvl="6" w:tentative="1">
+    <w:lvl w:ilvl="6">
       <w:start w:val="1"/>
       <w:numFmt w:val="bullet"/>
       <w:lvlText w:val=""/>
@@ -1637,7 +1962,7 @@
         <w:sz w:val="20"/>
       </w:rPr>
     </w:lvl>
-    <w:lvl w:ilvl="7" w:tentative="1">
+    <w:lvl w:ilvl="7">
       <w:start w:val="1"/>
       <w:numFmt w:val="bullet"/>
       <w:lvlText w:val=""/>
@@ -1653,7 +1978,7 @@
         <w:sz w:val="20"/>
       </w:rPr>
     </w:lvl>
-    <w:lvl w:ilvl="8" w:tentative="1">
+    <w:lvl w:ilvl="8">
       <w:start w:val="1"/>
       <w:numFmt w:val="bullet"/>
       <w:lvlText w:val=""/>
@@ -1690,7 +2015,7 @@
         <w:sz w:val="20"/>
       </w:rPr>
     </w:lvl>
-    <w:lvl w:ilvl="1" w:tentative="1">
+    <w:lvl w:ilvl="1">
       <w:start w:val="1"/>
       <w:numFmt w:val="bullet"/>
       <w:lvlText w:val="o"/>
@@ -1702,11 +2027,11 @@
         <w:ind w:left="1440" w:hanging="360"/>
       </w:pPr>
       <w:rPr>
-        <w:rFonts w:ascii="Courier New" w:hAnsi="Courier New" w:hint="default"/>
-        <w:sz w:val="20"/>
-      </w:rPr>
-    </w:lvl>
-    <w:lvl w:ilvl="2" w:tentative="1">
+        <w:rFonts w:ascii="Courier New" w:hAnsi="Courier New" w:cs="Times New Roman" w:hint="default"/>
+        <w:sz w:val="20"/>
+      </w:rPr>
+    </w:lvl>
+    <w:lvl w:ilvl="2">
       <w:start w:val="1"/>
       <w:numFmt w:val="bullet"/>
       <w:lvlText w:val=""/>
@@ -1722,7 +2047,7 @@
         <w:sz w:val="20"/>
       </w:rPr>
     </w:lvl>
-    <w:lvl w:ilvl="3" w:tentative="1">
+    <w:lvl w:ilvl="3">
       <w:start w:val="1"/>
       <w:numFmt w:val="bullet"/>
       <w:lvlText w:val=""/>
@@ -1738,7 +2063,7 @@
         <w:sz w:val="20"/>
       </w:rPr>
     </w:lvl>
-    <w:lvl w:ilvl="4" w:tentative="1">
+    <w:lvl w:ilvl="4">
       <w:start w:val="1"/>
       <w:numFmt w:val="bullet"/>
       <w:lvlText w:val=""/>
@@ -1754,7 +2079,7 @@
         <w:sz w:val="20"/>
       </w:rPr>
     </w:lvl>
-    <w:lvl w:ilvl="5" w:tentative="1">
+    <w:lvl w:ilvl="5">
       <w:start w:val="1"/>
       <w:numFmt w:val="bullet"/>
       <w:lvlText w:val=""/>
@@ -1770,7 +2095,7 @@
         <w:sz w:val="20"/>
       </w:rPr>
     </w:lvl>
-    <w:lvl w:ilvl="6" w:tentative="1">
+    <w:lvl w:ilvl="6">
       <w:start w:val="1"/>
       <w:numFmt w:val="bullet"/>
       <w:lvlText w:val=""/>
@@ -1786,7 +2111,7 @@
         <w:sz w:val="20"/>
       </w:rPr>
     </w:lvl>
-    <w:lvl w:ilvl="7" w:tentative="1">
+    <w:lvl w:ilvl="7">
       <w:start w:val="1"/>
       <w:numFmt w:val="bullet"/>
       <w:lvlText w:val=""/>
@@ -1802,7 +2127,7 @@
         <w:sz w:val="20"/>
       </w:rPr>
     </w:lvl>
-    <w:lvl w:ilvl="8" w:tentative="1">
+    <w:lvl w:ilvl="8">
       <w:start w:val="1"/>
       <w:numFmt w:val="bullet"/>
       <w:lvlText w:val=""/>
@@ -1839,7 +2164,7 @@
         <w:sz w:val="20"/>
       </w:rPr>
     </w:lvl>
-    <w:lvl w:ilvl="1" w:tentative="1">
+    <w:lvl w:ilvl="1">
       <w:start w:val="1"/>
       <w:numFmt w:val="bullet"/>
       <w:lvlText w:val="o"/>
@@ -1851,11 +2176,11 @@
         <w:ind w:left="1440" w:hanging="360"/>
       </w:pPr>
       <w:rPr>
-        <w:rFonts w:ascii="Courier New" w:hAnsi="Courier New" w:hint="default"/>
-        <w:sz w:val="20"/>
-      </w:rPr>
-    </w:lvl>
-    <w:lvl w:ilvl="2" w:tentative="1">
+        <w:rFonts w:ascii="Courier New" w:hAnsi="Courier New" w:cs="Times New Roman" w:hint="default"/>
+        <w:sz w:val="20"/>
+      </w:rPr>
+    </w:lvl>
+    <w:lvl w:ilvl="2">
       <w:start w:val="1"/>
       <w:numFmt w:val="bullet"/>
       <w:lvlText w:val=""/>
@@ -1871,7 +2196,7 @@
         <w:sz w:val="20"/>
       </w:rPr>
     </w:lvl>
-    <w:lvl w:ilvl="3" w:tentative="1">
+    <w:lvl w:ilvl="3">
       <w:start w:val="1"/>
       <w:numFmt w:val="bullet"/>
       <w:lvlText w:val=""/>
@@ -1887,7 +2212,7 @@
         <w:sz w:val="20"/>
       </w:rPr>
     </w:lvl>
-    <w:lvl w:ilvl="4" w:tentative="1">
+    <w:lvl w:ilvl="4">
       <w:start w:val="1"/>
       <w:numFmt w:val="bullet"/>
       <w:lvlText w:val=""/>
@@ -1903,7 +2228,7 @@
         <w:sz w:val="20"/>
       </w:rPr>
     </w:lvl>
-    <w:lvl w:ilvl="5" w:tentative="1">
+    <w:lvl w:ilvl="5">
       <w:start w:val="1"/>
       <w:numFmt w:val="bullet"/>
       <w:lvlText w:val=""/>
@@ -1919,7 +2244,7 @@
         <w:sz w:val="20"/>
       </w:rPr>
     </w:lvl>
-    <w:lvl w:ilvl="6" w:tentative="1">
+    <w:lvl w:ilvl="6">
       <w:start w:val="1"/>
       <w:numFmt w:val="bullet"/>
       <w:lvlText w:val=""/>
@@ -1935,7 +2260,7 @@
         <w:sz w:val="20"/>
       </w:rPr>
     </w:lvl>
-    <w:lvl w:ilvl="7" w:tentative="1">
+    <w:lvl w:ilvl="7">
       <w:start w:val="1"/>
       <w:numFmt w:val="bullet"/>
       <w:lvlText w:val=""/>
@@ -1951,7 +2276,7 @@
         <w:sz w:val="20"/>
       </w:rPr>
     </w:lvl>
-    <w:lvl w:ilvl="8" w:tentative="1">
+    <w:lvl w:ilvl="8">
       <w:start w:val="1"/>
       <w:numFmt w:val="bullet"/>
       <w:lvlText w:val=""/>
@@ -1988,7 +2313,7 @@
         <w:sz w:val="20"/>
       </w:rPr>
     </w:lvl>
-    <w:lvl w:ilvl="1" w:tentative="1">
+    <w:lvl w:ilvl="1">
       <w:start w:val="1"/>
       <w:numFmt w:val="bullet"/>
       <w:lvlText w:val="o"/>
@@ -2000,11 +2325,11 @@
         <w:ind w:left="1440" w:hanging="360"/>
       </w:pPr>
       <w:rPr>
-        <w:rFonts w:ascii="Courier New" w:hAnsi="Courier New" w:hint="default"/>
-        <w:sz w:val="20"/>
-      </w:rPr>
-    </w:lvl>
-    <w:lvl w:ilvl="2" w:tentative="1">
+        <w:rFonts w:ascii="Courier New" w:hAnsi="Courier New" w:cs="Times New Roman" w:hint="default"/>
+        <w:sz w:val="20"/>
+      </w:rPr>
+    </w:lvl>
+    <w:lvl w:ilvl="2">
       <w:start w:val="1"/>
       <w:numFmt w:val="bullet"/>
       <w:lvlText w:val=""/>
@@ -2020,7 +2345,7 @@
         <w:sz w:val="20"/>
       </w:rPr>
     </w:lvl>
-    <w:lvl w:ilvl="3" w:tentative="1">
+    <w:lvl w:ilvl="3">
       <w:start w:val="1"/>
       <w:numFmt w:val="bullet"/>
       <w:lvlText w:val=""/>
@@ -2036,7 +2361,7 @@
         <w:sz w:val="20"/>
       </w:rPr>
     </w:lvl>
-    <w:lvl w:ilvl="4" w:tentative="1">
+    <w:lvl w:ilvl="4">
       <w:start w:val="1"/>
       <w:numFmt w:val="bullet"/>
       <w:lvlText w:val=""/>
@@ -2052,7 +2377,7 @@
         <w:sz w:val="20"/>
       </w:rPr>
     </w:lvl>
-    <w:lvl w:ilvl="5" w:tentative="1">
+    <w:lvl w:ilvl="5">
       <w:start w:val="1"/>
       <w:numFmt w:val="bullet"/>
       <w:lvlText w:val=""/>
@@ -2068,7 +2393,7 @@
         <w:sz w:val="20"/>
       </w:rPr>
     </w:lvl>
-    <w:lvl w:ilvl="6" w:tentative="1">
+    <w:lvl w:ilvl="6">
       <w:start w:val="1"/>
       <w:numFmt w:val="bullet"/>
       <w:lvlText w:val=""/>
@@ -2084,7 +2409,7 @@
         <w:sz w:val="20"/>
       </w:rPr>
     </w:lvl>
-    <w:lvl w:ilvl="7" w:tentative="1">
+    <w:lvl w:ilvl="7">
       <w:start w:val="1"/>
       <w:numFmt w:val="bullet"/>
       <w:lvlText w:val=""/>
@@ -2100,7 +2425,7 @@
         <w:sz w:val="20"/>
       </w:rPr>
     </w:lvl>
-    <w:lvl w:ilvl="8" w:tentative="1">
+    <w:lvl w:ilvl="8">
       <w:start w:val="1"/>
       <w:numFmt w:val="bullet"/>
       <w:lvlText w:val=""/>
@@ -2137,7 +2462,7 @@
         <w:sz w:val="20"/>
       </w:rPr>
     </w:lvl>
-    <w:lvl w:ilvl="1" w:tentative="1">
+    <w:lvl w:ilvl="1">
       <w:start w:val="1"/>
       <w:numFmt w:val="bullet"/>
       <w:lvlText w:val="o"/>
@@ -2149,11 +2474,11 @@
         <w:ind w:left="1440" w:hanging="360"/>
       </w:pPr>
       <w:rPr>
-        <w:rFonts w:ascii="Courier New" w:hAnsi="Courier New" w:hint="default"/>
-        <w:sz w:val="20"/>
-      </w:rPr>
-    </w:lvl>
-    <w:lvl w:ilvl="2" w:tentative="1">
+        <w:rFonts w:ascii="Courier New" w:hAnsi="Courier New" w:cs="Times New Roman" w:hint="default"/>
+        <w:sz w:val="20"/>
+      </w:rPr>
+    </w:lvl>
+    <w:lvl w:ilvl="2">
       <w:start w:val="1"/>
       <w:numFmt w:val="bullet"/>
       <w:lvlText w:val=""/>
@@ -2169,7 +2494,7 @@
         <w:sz w:val="20"/>
       </w:rPr>
     </w:lvl>
-    <w:lvl w:ilvl="3" w:tentative="1">
+    <w:lvl w:ilvl="3">
       <w:start w:val="1"/>
       <w:numFmt w:val="bullet"/>
       <w:lvlText w:val=""/>
@@ -2185,7 +2510,7 @@
         <w:sz w:val="20"/>
       </w:rPr>
     </w:lvl>
-    <w:lvl w:ilvl="4" w:tentative="1">
+    <w:lvl w:ilvl="4">
       <w:start w:val="1"/>
       <w:numFmt w:val="bullet"/>
       <w:lvlText w:val=""/>
@@ -2201,7 +2526,7 @@
         <w:sz w:val="20"/>
       </w:rPr>
     </w:lvl>
-    <w:lvl w:ilvl="5" w:tentative="1">
+    <w:lvl w:ilvl="5">
       <w:start w:val="1"/>
       <w:numFmt w:val="bullet"/>
       <w:lvlText w:val=""/>
@@ -2217,7 +2542,7 @@
         <w:sz w:val="20"/>
       </w:rPr>
     </w:lvl>
-    <w:lvl w:ilvl="6" w:tentative="1">
+    <w:lvl w:ilvl="6">
       <w:start w:val="1"/>
       <w:numFmt w:val="bullet"/>
       <w:lvlText w:val=""/>
@@ -2233,7 +2558,7 @@
         <w:sz w:val="20"/>
       </w:rPr>
     </w:lvl>
-    <w:lvl w:ilvl="7" w:tentative="1">
+    <w:lvl w:ilvl="7">
       <w:start w:val="1"/>
       <w:numFmt w:val="bullet"/>
       <w:lvlText w:val=""/>
@@ -2249,7 +2574,7 @@
         <w:sz w:val="20"/>
       </w:rPr>
     </w:lvl>
-    <w:lvl w:ilvl="8" w:tentative="1">
+    <w:lvl w:ilvl="8">
       <w:start w:val="1"/>
       <w:numFmt w:val="bullet"/>
       <w:lvlText w:val=""/>
@@ -2266,38 +2591,137 @@
       </w:rPr>
     </w:lvl>
   </w:abstractNum>
-  <w:num w:numId="1" w16cid:durableId="1255632382">
+  <w:num w:numId="1" w16cid:durableId="685987060">
     <w:abstractNumId w:val="8"/>
+    <w:lvlOverride w:ilvl="0"/>
+    <w:lvlOverride w:ilvl="1"/>
+    <w:lvlOverride w:ilvl="2"/>
+    <w:lvlOverride w:ilvl="3"/>
+    <w:lvlOverride w:ilvl="4"/>
+    <w:lvlOverride w:ilvl="5"/>
+    <w:lvlOverride w:ilvl="6"/>
+    <w:lvlOverride w:ilvl="7"/>
+    <w:lvlOverride w:ilvl="8"/>
   </w:num>
-  <w:num w:numId="2" w16cid:durableId="1244608831">
+  <w:num w:numId="2" w16cid:durableId="1808427526">
     <w:abstractNumId w:val="10"/>
+    <w:lvlOverride w:ilvl="0"/>
+    <w:lvlOverride w:ilvl="1"/>
+    <w:lvlOverride w:ilvl="2"/>
+    <w:lvlOverride w:ilvl="3"/>
+    <w:lvlOverride w:ilvl="4"/>
+    <w:lvlOverride w:ilvl="5"/>
+    <w:lvlOverride w:ilvl="6"/>
+    <w:lvlOverride w:ilvl="7"/>
+    <w:lvlOverride w:ilvl="8"/>
   </w:num>
-  <w:num w:numId="3" w16cid:durableId="678118793">
+  <w:num w:numId="3" w16cid:durableId="1097557580">
     <w:abstractNumId w:val="6"/>
+    <w:lvlOverride w:ilvl="0"/>
+    <w:lvlOverride w:ilvl="1"/>
+    <w:lvlOverride w:ilvl="2"/>
+    <w:lvlOverride w:ilvl="3"/>
+    <w:lvlOverride w:ilvl="4"/>
+    <w:lvlOverride w:ilvl="5"/>
+    <w:lvlOverride w:ilvl="6"/>
+    <w:lvlOverride w:ilvl="7"/>
+    <w:lvlOverride w:ilvl="8"/>
   </w:num>
-  <w:num w:numId="4" w16cid:durableId="1399790378">
+  <w:num w:numId="4" w16cid:durableId="1339504042">
     <w:abstractNumId w:val="9"/>
+    <w:lvlOverride w:ilvl="0"/>
+    <w:lvlOverride w:ilvl="1"/>
+    <w:lvlOverride w:ilvl="2"/>
+    <w:lvlOverride w:ilvl="3"/>
+    <w:lvlOverride w:ilvl="4"/>
+    <w:lvlOverride w:ilvl="5"/>
+    <w:lvlOverride w:ilvl="6"/>
+    <w:lvlOverride w:ilvl="7"/>
+    <w:lvlOverride w:ilvl="8"/>
   </w:num>
-  <w:num w:numId="5" w16cid:durableId="800074095">
+  <w:num w:numId="5" w16cid:durableId="315501477">
     <w:abstractNumId w:val="1"/>
+    <w:lvlOverride w:ilvl="0"/>
+    <w:lvlOverride w:ilvl="1"/>
+    <w:lvlOverride w:ilvl="2"/>
+    <w:lvlOverride w:ilvl="3"/>
+    <w:lvlOverride w:ilvl="4"/>
+    <w:lvlOverride w:ilvl="5"/>
+    <w:lvlOverride w:ilvl="6"/>
+    <w:lvlOverride w:ilvl="7"/>
+    <w:lvlOverride w:ilvl="8"/>
   </w:num>
-  <w:num w:numId="6" w16cid:durableId="844057099">
+  <w:num w:numId="6" w16cid:durableId="1981230433">
     <w:abstractNumId w:val="4"/>
+    <w:lvlOverride w:ilvl="0"/>
+    <w:lvlOverride w:ilvl="1"/>
+    <w:lvlOverride w:ilvl="2"/>
+    <w:lvlOverride w:ilvl="3"/>
+    <w:lvlOverride w:ilvl="4"/>
+    <w:lvlOverride w:ilvl="5"/>
+    <w:lvlOverride w:ilvl="6"/>
+    <w:lvlOverride w:ilvl="7"/>
+    <w:lvlOverride w:ilvl="8"/>
   </w:num>
-  <w:num w:numId="7" w16cid:durableId="902981269">
+  <w:num w:numId="7" w16cid:durableId="120727342">
     <w:abstractNumId w:val="5"/>
+    <w:lvlOverride w:ilvl="0"/>
+    <w:lvlOverride w:ilvl="1"/>
+    <w:lvlOverride w:ilvl="2"/>
+    <w:lvlOverride w:ilvl="3"/>
+    <w:lvlOverride w:ilvl="4"/>
+    <w:lvlOverride w:ilvl="5"/>
+    <w:lvlOverride w:ilvl="6"/>
+    <w:lvlOverride w:ilvl="7"/>
+    <w:lvlOverride w:ilvl="8"/>
   </w:num>
-  <w:num w:numId="8" w16cid:durableId="1502772137">
+  <w:num w:numId="8" w16cid:durableId="319888196">
     <w:abstractNumId w:val="2"/>
+    <w:lvlOverride w:ilvl="0"/>
+    <w:lvlOverride w:ilvl="1"/>
+    <w:lvlOverride w:ilvl="2"/>
+    <w:lvlOverride w:ilvl="3"/>
+    <w:lvlOverride w:ilvl="4"/>
+    <w:lvlOverride w:ilvl="5"/>
+    <w:lvlOverride w:ilvl="6"/>
+    <w:lvlOverride w:ilvl="7"/>
+    <w:lvlOverride w:ilvl="8"/>
   </w:num>
-  <w:num w:numId="9" w16cid:durableId="89854666">
+  <w:num w:numId="9" w16cid:durableId="2116556062">
     <w:abstractNumId w:val="7"/>
+    <w:lvlOverride w:ilvl="0"/>
+    <w:lvlOverride w:ilvl="1"/>
+    <w:lvlOverride w:ilvl="2"/>
+    <w:lvlOverride w:ilvl="3"/>
+    <w:lvlOverride w:ilvl="4"/>
+    <w:lvlOverride w:ilvl="5"/>
+    <w:lvlOverride w:ilvl="6"/>
+    <w:lvlOverride w:ilvl="7"/>
+    <w:lvlOverride w:ilvl="8"/>
   </w:num>
-  <w:num w:numId="10" w16cid:durableId="1380862341">
+  <w:num w:numId="10" w16cid:durableId="971911039">
     <w:abstractNumId w:val="0"/>
+    <w:lvlOverride w:ilvl="0"/>
+    <w:lvlOverride w:ilvl="1"/>
+    <w:lvlOverride w:ilvl="2"/>
+    <w:lvlOverride w:ilvl="3"/>
+    <w:lvlOverride w:ilvl="4"/>
+    <w:lvlOverride w:ilvl="5"/>
+    <w:lvlOverride w:ilvl="6"/>
+    <w:lvlOverride w:ilvl="7"/>
+    <w:lvlOverride w:ilvl="8"/>
   </w:num>
-  <w:num w:numId="11" w16cid:durableId="832331178">
+  <w:num w:numId="11" w16cid:durableId="1034307075">
     <w:abstractNumId w:val="3"/>
+    <w:lvlOverride w:ilvl="0"/>
+    <w:lvlOverride w:ilvl="1"/>
+    <w:lvlOverride w:ilvl="2"/>
+    <w:lvlOverride w:ilvl="3"/>
+    <w:lvlOverride w:ilvl="4"/>
+    <w:lvlOverride w:ilvl="5"/>
+    <w:lvlOverride w:ilvl="6"/>
+    <w:lvlOverride w:ilvl="7"/>
+    <w:lvlOverride w:ilvl="8"/>
   </w:num>
 </w:numbering>
 </file>
@@ -2311,7 +2735,7 @@
         <w:kern w:val="2"/>
         <w:sz w:val="22"/>
         <w:szCs w:val="22"/>
-        <w:lang w:val="en-PK" w:eastAsia="en-US" w:bidi="ar-SA"/>
+        <w:lang w:val="en-US" w:eastAsia="en-US" w:bidi="ar-SA"/>
         <w14:ligatures w14:val="standardContextual"/>
       </w:rPr>
     </w:rPrDefault>
@@ -2710,7 +3134,7 @@
     <w:link w:val="Heading1Char"/>
     <w:uiPriority w:val="9"/>
     <w:qFormat/>
-    <w:rsid w:val="009E43B4"/>
+    <w:rsid w:val="00082561"/>
     <w:pPr>
       <w:keepNext/>
       <w:keepLines/>
@@ -2719,7 +3143,7 @@
     </w:pPr>
     <w:rPr>
       <w:rFonts w:asciiTheme="majorHAnsi" w:eastAsiaTheme="majorEastAsia" w:hAnsiTheme="majorHAnsi" w:cstheme="majorBidi"/>
-      <w:color w:val="0F4761" w:themeColor="accent1" w:themeShade="BF"/>
+      <w:color w:val="2E74B5" w:themeColor="accent1" w:themeShade="BF"/>
       <w:sz w:val="40"/>
       <w:szCs w:val="40"/>
     </w:rPr>
@@ -2733,7 +3157,7 @@
     <w:semiHidden/>
     <w:unhideWhenUsed/>
     <w:qFormat/>
-    <w:rsid w:val="009E43B4"/>
+    <w:rsid w:val="00082561"/>
     <w:pPr>
       <w:keepNext/>
       <w:keepLines/>
@@ -2742,7 +3166,7 @@
     </w:pPr>
     <w:rPr>
       <w:rFonts w:asciiTheme="majorHAnsi" w:eastAsiaTheme="majorEastAsia" w:hAnsiTheme="majorHAnsi" w:cstheme="majorBidi"/>
-      <w:color w:val="0F4761" w:themeColor="accent1" w:themeShade="BF"/>
+      <w:color w:val="2E74B5" w:themeColor="accent1" w:themeShade="BF"/>
       <w:sz w:val="32"/>
       <w:szCs w:val="32"/>
     </w:rPr>
@@ -2756,7 +3180,7 @@
     <w:semiHidden/>
     <w:unhideWhenUsed/>
     <w:qFormat/>
-    <w:rsid w:val="009E43B4"/>
+    <w:rsid w:val="00082561"/>
     <w:pPr>
       <w:keepNext/>
       <w:keepLines/>
@@ -2765,7 +3189,7 @@
     </w:pPr>
     <w:rPr>
       <w:rFonts w:eastAsiaTheme="majorEastAsia" w:cstheme="majorBidi"/>
-      <w:color w:val="0F4761" w:themeColor="accent1" w:themeShade="BF"/>
+      <w:color w:val="2E74B5" w:themeColor="accent1" w:themeShade="BF"/>
       <w:sz w:val="28"/>
       <w:szCs w:val="28"/>
     </w:rPr>
@@ -2779,7 +3203,7 @@
     <w:semiHidden/>
     <w:unhideWhenUsed/>
     <w:qFormat/>
-    <w:rsid w:val="009E43B4"/>
+    <w:rsid w:val="00082561"/>
     <w:pPr>
       <w:keepNext/>
       <w:keepLines/>
@@ -2790,7 +3214,7 @@
       <w:rFonts w:eastAsiaTheme="majorEastAsia" w:cstheme="majorBidi"/>
       <w:i/>
       <w:iCs/>
-      <w:color w:val="0F4761" w:themeColor="accent1" w:themeShade="BF"/>
+      <w:color w:val="2E74B5" w:themeColor="accent1" w:themeShade="BF"/>
     </w:rPr>
   </w:style>
   <w:style w:type="paragraph" w:styleId="Heading5">
@@ -2802,7 +3226,7 @@
     <w:semiHidden/>
     <w:unhideWhenUsed/>
     <w:qFormat/>
-    <w:rsid w:val="009E43B4"/>
+    <w:rsid w:val="00082561"/>
     <w:pPr>
       <w:keepNext/>
       <w:keepLines/>
@@ -2811,7 +3235,7 @@
     </w:pPr>
     <w:rPr>
       <w:rFonts w:eastAsiaTheme="majorEastAsia" w:cstheme="majorBidi"/>
-      <w:color w:val="0F4761" w:themeColor="accent1" w:themeShade="BF"/>
+      <w:color w:val="2E74B5" w:themeColor="accent1" w:themeShade="BF"/>
     </w:rPr>
   </w:style>
   <w:style w:type="paragraph" w:styleId="Heading6">
@@ -2823,7 +3247,7 @@
     <w:semiHidden/>
     <w:unhideWhenUsed/>
     <w:qFormat/>
-    <w:rsid w:val="009E43B4"/>
+    <w:rsid w:val="00082561"/>
     <w:pPr>
       <w:keepNext/>
       <w:keepLines/>
@@ -2846,7 +3270,7 @@
     <w:semiHidden/>
     <w:unhideWhenUsed/>
     <w:qFormat/>
-    <w:rsid w:val="009E43B4"/>
+    <w:rsid w:val="00082561"/>
     <w:pPr>
       <w:keepNext/>
       <w:keepLines/>
@@ -2867,7 +3291,7 @@
     <w:semiHidden/>
     <w:unhideWhenUsed/>
     <w:qFormat/>
-    <w:rsid w:val="009E43B4"/>
+    <w:rsid w:val="00082561"/>
     <w:pPr>
       <w:keepNext/>
       <w:keepLines/>
@@ -2890,7 +3314,7 @@
     <w:semiHidden/>
     <w:unhideWhenUsed/>
     <w:qFormat/>
-    <w:rsid w:val="009E43B4"/>
+    <w:rsid w:val="00082561"/>
     <w:pPr>
       <w:keepNext/>
       <w:keepLines/>
@@ -2905,7 +3329,6 @@
   <w:style w:type="character" w:default="1" w:styleId="DefaultParagraphFont">
     <w:name w:val="Default Paragraph Font"/>
     <w:uiPriority w:val="1"/>
-    <w:semiHidden/>
     <w:unhideWhenUsed/>
   </w:style>
   <w:style w:type="table" w:default="1" w:styleId="TableNormal">
@@ -2934,10 +3357,10 @@
     <w:basedOn w:val="DefaultParagraphFont"/>
     <w:link w:val="Heading1"/>
     <w:uiPriority w:val="9"/>
-    <w:rsid w:val="009E43B4"/>
+    <w:rsid w:val="00082561"/>
     <w:rPr>
       <w:rFonts w:asciiTheme="majorHAnsi" w:eastAsiaTheme="majorEastAsia" w:hAnsiTheme="majorHAnsi" w:cstheme="majorBidi"/>
-      <w:color w:val="0F4761" w:themeColor="accent1" w:themeShade="BF"/>
+      <w:color w:val="2E74B5" w:themeColor="accent1" w:themeShade="BF"/>
       <w:sz w:val="40"/>
       <w:szCs w:val="40"/>
     </w:rPr>
@@ -2948,10 +3371,10 @@
     <w:link w:val="Heading2"/>
     <w:uiPriority w:val="9"/>
     <w:semiHidden/>
-    <w:rsid w:val="009E43B4"/>
+    <w:rsid w:val="00082561"/>
     <w:rPr>
       <w:rFonts w:asciiTheme="majorHAnsi" w:eastAsiaTheme="majorEastAsia" w:hAnsiTheme="majorHAnsi" w:cstheme="majorBidi"/>
-      <w:color w:val="0F4761" w:themeColor="accent1" w:themeShade="BF"/>
+      <w:color w:val="2E74B5" w:themeColor="accent1" w:themeShade="BF"/>
       <w:sz w:val="32"/>
       <w:szCs w:val="32"/>
     </w:rPr>
@@ -2962,10 +3385,10 @@
     <w:link w:val="Heading3"/>
     <w:uiPriority w:val="9"/>
     <w:semiHidden/>
-    <w:rsid w:val="009E43B4"/>
+    <w:rsid w:val="00082561"/>
     <w:rPr>
       <w:rFonts w:eastAsiaTheme="majorEastAsia" w:cstheme="majorBidi"/>
-      <w:color w:val="0F4761" w:themeColor="accent1" w:themeShade="BF"/>
+      <w:color w:val="2E74B5" w:themeColor="accent1" w:themeShade="BF"/>
       <w:sz w:val="28"/>
       <w:szCs w:val="28"/>
     </w:rPr>
@@ -2976,12 +3399,12 @@
     <w:link w:val="Heading4"/>
     <w:uiPriority w:val="9"/>
     <w:semiHidden/>
-    <w:rsid w:val="009E43B4"/>
+    <w:rsid w:val="00082561"/>
     <w:rPr>
       <w:rFonts w:eastAsiaTheme="majorEastAsia" w:cstheme="majorBidi"/>
       <w:i/>
       <w:iCs/>
-      <w:color w:val="0F4761" w:themeColor="accent1" w:themeShade="BF"/>
+      <w:color w:val="2E74B5" w:themeColor="accent1" w:themeShade="BF"/>
     </w:rPr>
   </w:style>
   <w:style w:type="character" w:customStyle="1" w:styleId="Heading5Char">
@@ -2990,10 +3413,10 @@
     <w:link w:val="Heading5"/>
     <w:uiPriority w:val="9"/>
     <w:semiHidden/>
-    <w:rsid w:val="009E43B4"/>
+    <w:rsid w:val="00082561"/>
     <w:rPr>
       <w:rFonts w:eastAsiaTheme="majorEastAsia" w:cstheme="majorBidi"/>
-      <w:color w:val="0F4761" w:themeColor="accent1" w:themeShade="BF"/>
+      <w:color w:val="2E74B5" w:themeColor="accent1" w:themeShade="BF"/>
     </w:rPr>
   </w:style>
   <w:style w:type="character" w:customStyle="1" w:styleId="Heading6Char">
@@ -3002,7 +3425,7 @@
     <w:link w:val="Heading6"/>
     <w:uiPriority w:val="9"/>
     <w:semiHidden/>
-    <w:rsid w:val="009E43B4"/>
+    <w:rsid w:val="00082561"/>
     <w:rPr>
       <w:rFonts w:eastAsiaTheme="majorEastAsia" w:cstheme="majorBidi"/>
       <w:i/>
@@ -3016,7 +3439,7 @@
     <w:link w:val="Heading7"/>
     <w:uiPriority w:val="9"/>
     <w:semiHidden/>
-    <w:rsid w:val="009E43B4"/>
+    <w:rsid w:val="00082561"/>
     <w:rPr>
       <w:rFonts w:eastAsiaTheme="majorEastAsia" w:cstheme="majorBidi"/>
       <w:color w:val="595959" w:themeColor="text1" w:themeTint="A6"/>
@@ -3028,7 +3451,7 @@
     <w:link w:val="Heading8"/>
     <w:uiPriority w:val="9"/>
     <w:semiHidden/>
-    <w:rsid w:val="009E43B4"/>
+    <w:rsid w:val="00082561"/>
     <w:rPr>
       <w:rFonts w:eastAsiaTheme="majorEastAsia" w:cstheme="majorBidi"/>
       <w:i/>
@@ -3042,7 +3465,7 @@
     <w:link w:val="Heading9"/>
     <w:uiPriority w:val="9"/>
     <w:semiHidden/>
-    <w:rsid w:val="009E43B4"/>
+    <w:rsid w:val="00082561"/>
     <w:rPr>
       <w:rFonts w:eastAsiaTheme="majorEastAsia" w:cstheme="majorBidi"/>
       <w:color w:val="272727" w:themeColor="text1" w:themeTint="D8"/>
@@ -3055,7 +3478,7 @@
     <w:link w:val="TitleChar"/>
     <w:uiPriority w:val="10"/>
     <w:qFormat/>
-    <w:rsid w:val="009E43B4"/>
+    <w:rsid w:val="00082561"/>
     <w:pPr>
       <w:spacing w:after="80" w:line="240" w:lineRule="auto"/>
       <w:contextualSpacing/>
@@ -3073,7 +3496,7 @@
     <w:basedOn w:val="DefaultParagraphFont"/>
     <w:link w:val="Title"/>
     <w:uiPriority w:val="10"/>
-    <w:rsid w:val="009E43B4"/>
+    <w:rsid w:val="00082561"/>
     <w:rPr>
       <w:rFonts w:asciiTheme="majorHAnsi" w:eastAsiaTheme="majorEastAsia" w:hAnsiTheme="majorHAnsi" w:cstheme="majorBidi"/>
       <w:spacing w:val="-10"/>
@@ -3089,7 +3512,7 @@
     <w:link w:val="SubtitleChar"/>
     <w:uiPriority w:val="11"/>
     <w:qFormat/>
-    <w:rsid w:val="009E43B4"/>
+    <w:rsid w:val="00082561"/>
     <w:pPr>
       <w:numPr>
         <w:ilvl w:val="1"/>
@@ -3108,7 +3531,7 @@
     <w:basedOn w:val="DefaultParagraphFont"/>
     <w:link w:val="Subtitle"/>
     <w:uiPriority w:val="11"/>
-    <w:rsid w:val="009E43B4"/>
+    <w:rsid w:val="00082561"/>
     <w:rPr>
       <w:rFonts w:eastAsiaTheme="majorEastAsia" w:cstheme="majorBidi"/>
       <w:color w:val="595959" w:themeColor="text1" w:themeTint="A6"/>
@@ -3124,7 +3547,7 @@
     <w:link w:val="QuoteChar"/>
     <w:uiPriority w:val="29"/>
     <w:qFormat/>
-    <w:rsid w:val="009E43B4"/>
+    <w:rsid w:val="00082561"/>
     <w:pPr>
       <w:spacing w:before="160"/>
       <w:jc w:val="center"/>
@@ -3140,7 +3563,7 @@
     <w:basedOn w:val="DefaultParagraphFont"/>
     <w:link w:val="Quote"/>
     <w:uiPriority w:val="29"/>
-    <w:rsid w:val="009E43B4"/>
+    <w:rsid w:val="00082561"/>
     <w:rPr>
       <w:i/>
       <w:iCs/>
@@ -3152,7 +3575,7 @@
     <w:basedOn w:val="Normal"/>
     <w:uiPriority w:val="34"/>
     <w:qFormat/>
-    <w:rsid w:val="009E43B4"/>
+    <w:rsid w:val="00082561"/>
     <w:pPr>
       <w:ind w:left="720"/>
       <w:contextualSpacing/>
@@ -3163,11 +3586,11 @@
     <w:basedOn w:val="DefaultParagraphFont"/>
     <w:uiPriority w:val="21"/>
     <w:qFormat/>
-    <w:rsid w:val="009E43B4"/>
+    <w:rsid w:val="00082561"/>
     <w:rPr>
       <w:i/>
       <w:iCs/>
-      <w:color w:val="0F4761" w:themeColor="accent1" w:themeShade="BF"/>
+      <w:color w:val="2E74B5" w:themeColor="accent1" w:themeShade="BF"/>
     </w:rPr>
   </w:style>
   <w:style w:type="paragraph" w:styleId="IntenseQuote">
@@ -3177,11 +3600,11 @@
     <w:link w:val="IntenseQuoteChar"/>
     <w:uiPriority w:val="30"/>
     <w:qFormat/>
-    <w:rsid w:val="009E43B4"/>
+    <w:rsid w:val="00082561"/>
     <w:pPr>
       <w:pBdr>
-        <w:top w:val="single" w:sz="4" w:space="10" w:color="0F4761" w:themeColor="accent1" w:themeShade="BF"/>
-        <w:bottom w:val="single" w:sz="4" w:space="10" w:color="0F4761" w:themeColor="accent1" w:themeShade="BF"/>
+        <w:top w:val="single" w:sz="4" w:space="10" w:color="2E74B5" w:themeColor="accent1" w:themeShade="BF"/>
+        <w:bottom w:val="single" w:sz="4" w:space="10" w:color="2E74B5" w:themeColor="accent1" w:themeShade="BF"/>
       </w:pBdr>
       <w:spacing w:before="360" w:after="360"/>
       <w:ind w:left="864" w:right="864"/>
@@ -3190,7 +3613,7 @@
     <w:rPr>
       <w:i/>
       <w:iCs/>
-      <w:color w:val="0F4761" w:themeColor="accent1" w:themeShade="BF"/>
+      <w:color w:val="2E74B5" w:themeColor="accent1" w:themeShade="BF"/>
     </w:rPr>
   </w:style>
   <w:style w:type="character" w:customStyle="1" w:styleId="IntenseQuoteChar">
@@ -3198,11 +3621,11 @@
     <w:basedOn w:val="DefaultParagraphFont"/>
     <w:link w:val="IntenseQuote"/>
     <w:uiPriority w:val="30"/>
-    <w:rsid w:val="009E43B4"/>
+    <w:rsid w:val="00082561"/>
     <w:rPr>
       <w:i/>
       <w:iCs/>
-      <w:color w:val="0F4761" w:themeColor="accent1" w:themeShade="BF"/>
+      <w:color w:val="2E74B5" w:themeColor="accent1" w:themeShade="BF"/>
     </w:rPr>
   </w:style>
   <w:style w:type="character" w:styleId="IntenseReference">
@@ -3210,12 +3633,12 @@
     <w:basedOn w:val="DefaultParagraphFont"/>
     <w:uiPriority w:val="32"/>
     <w:qFormat/>
-    <w:rsid w:val="009E43B4"/>
+    <w:rsid w:val="00082561"/>
     <w:rPr>
       <w:b/>
       <w:bCs/>
       <w:smallCaps/>
-      <w:color w:val="0F4761" w:themeColor="accent1" w:themeShade="BF"/>
+      <w:color w:val="2E74B5" w:themeColor="accent1" w:themeShade="BF"/>
       <w:spacing w:val="5"/>
     </w:rPr>
   </w:style>
@@ -3233,39 +3656,39 @@
         <a:sysClr val="window" lastClr="FFFFFF"/>
       </a:lt1>
       <a:dk2>
-        <a:srgbClr val="0E2841"/>
+        <a:srgbClr val="44546A"/>
       </a:dk2>
       <a:lt2>
-        <a:srgbClr val="E8E8E8"/>
+        <a:srgbClr val="E7E6E6"/>
       </a:lt2>
       <a:accent1>
-        <a:srgbClr val="156082"/>
+        <a:srgbClr val="5B9BD5"/>
       </a:accent1>
       <a:accent2>
-        <a:srgbClr val="E97132"/>
+        <a:srgbClr val="ED7D31"/>
       </a:accent2>
       <a:accent3>
-        <a:srgbClr val="196B24"/>
+        <a:srgbClr val="A5A5A5"/>
       </a:accent3>
       <a:accent4>
-        <a:srgbClr val="0F9ED5"/>
+        <a:srgbClr val="FFC000"/>
       </a:accent4>
       <a:accent5>
-        <a:srgbClr val="A02B93"/>
+        <a:srgbClr val="4472C4"/>
       </a:accent5>
       <a:accent6>
-        <a:srgbClr val="4EA72E"/>
+        <a:srgbClr val="70AD47"/>
       </a:accent6>
       <a:hlink>
-        <a:srgbClr val="467886"/>
+        <a:srgbClr val="0563C1"/>
       </a:hlink>
       <a:folHlink>
-        <a:srgbClr val="96607D"/>
+        <a:srgbClr val="954F72"/>
       </a:folHlink>
     </a:clrScheme>
     <a:fontScheme name="Office">
       <a:majorFont>
-        <a:latin typeface="Aptos Display" panose="02110004020202020204"/>
+        <a:latin typeface="Calibri Light" panose="020F0302020204030204"/>
         <a:ea typeface=""/>
         <a:cs typeface=""/>
         <a:font script="Jpan" typeface="游ゴシック Light"/>
@@ -3317,7 +3740,7 @@
         <a:font script="Tfng" typeface="Ebrima"/>
       </a:majorFont>
       <a:minorFont>
-        <a:latin typeface="Aptos" panose="02110004020202020204"/>
+        <a:latin typeface="Calibri" panose="020F0502020204030204"/>
         <a:ea typeface=""/>
         <a:cs typeface=""/>
         <a:font script="Jpan" typeface="游ゴシック"/>

</xml_diff>

<commit_message>
Inventory Features Complete PO start
</commit_message>
<xml_diff>
--- a/Document/Screen Document.docx
+++ b/Document/Screen Document.docx
@@ -7,28 +7,18 @@
         <w:rPr>
           <w:b/>
           <w:bCs/>
-          <w:lang/>
         </w:rPr>
       </w:pPr>
       <w:r>
         <w:rPr>
           <w:b/>
           <w:bCs/>
-          <w:lang/>
         </w:rPr>
-        <w:t>1. Small Organization Features</w:t>
+        <w:t>1. Organization Features</w:t>
       </w:r>
     </w:p>
     <w:p>
-      <w:pPr>
-        <w:rPr>
-          <w:lang/>
-        </w:rPr>
-      </w:pPr>
       <w:r>
-        <w:rPr>
-          <w:lang/>
-        </w:rPr>
         <w:t>These features focus on fundamental inventory management and operational efficiency.</w:t>
       </w:r>
     </w:p>
@@ -37,14 +27,12 @@
         <w:rPr>
           <w:b/>
           <w:bCs/>
-          <w:lang/>
         </w:rPr>
       </w:pPr>
       <w:r>
         <w:rPr>
           <w:b/>
           <w:bCs/>
-          <w:lang/>
         </w:rPr>
         <w:t>Inventory Management</w:t>
       </w:r>
@@ -55,14 +43,8 @@
           <w:ilvl w:val="0"/>
           <w:numId w:val="1"/>
         </w:numPr>
-        <w:rPr>
-          <w:lang/>
-        </w:rPr>
       </w:pPr>
       <w:r>
-        <w:rPr>
-          <w:lang/>
-        </w:rPr>
         <w:t>Add/Edit/Delete inventory items</w:t>
       </w:r>
     </w:p>
@@ -72,14 +54,8 @@
           <w:ilvl w:val="0"/>
           <w:numId w:val="1"/>
         </w:numPr>
-        <w:rPr>
-          <w:lang/>
-        </w:rPr>
       </w:pPr>
       <w:r>
-        <w:rPr>
-          <w:lang/>
-        </w:rPr>
         <w:t>Track stock levels (quantity in/out)</w:t>
       </w:r>
     </w:p>
@@ -89,14 +65,8 @@
           <w:ilvl w:val="0"/>
           <w:numId w:val="1"/>
         </w:numPr>
-        <w:rPr>
-          <w:lang/>
-        </w:rPr>
       </w:pPr>
       <w:r>
-        <w:rPr>
-          <w:lang/>
-        </w:rPr>
         <w:t>Categorize inventory (e.g., office supplies, IT equipment)</w:t>
       </w:r>
     </w:p>
@@ -106,15 +76,9 @@
           <w:ilvl w:val="0"/>
           <w:numId w:val="1"/>
         </w:numPr>
-        <w:rPr>
-          <w:lang/>
-        </w:rPr>
       </w:pPr>
       <w:r>
-        <w:rPr>
-          <w:lang/>
-        </w:rPr>
-        <w:t>Barcode/QR code for inventory identification</w:t>
+        <w:t>Low stock alerts</w:t>
       </w:r>
     </w:p>
     <w:p>
@@ -123,115 +87,110 @@
           <w:ilvl w:val="0"/>
           <w:numId w:val="1"/>
         </w:numPr>
-        <w:rPr>
-          <w:lang/>
-        </w:rPr>
       </w:pPr>
       <w:r>
-        <w:rPr>
-          <w:lang/>
-        </w:rPr>
-        <w:t>Low stock alerts</w:t>
+        <w:t>Batch/lot tracking</w:t>
       </w:r>
     </w:p>
     <w:p>
       <w:pPr>
-        <w:rPr>
-          <w:b/>
-          <w:bCs/>
-          <w:lang/>
-        </w:rPr>
+        <w:numPr>
+          <w:ilvl w:val="0"/>
+          <w:numId w:val="1"/>
+        </w:numPr>
+      </w:pPr>
+      <w:r>
+        <w:t>Inventory location tracking (warehouse, floor, department)</w:t>
+      </w:r>
+    </w:p>
+    <w:p/>
+    <w:p>
+      <w:pPr>
+        <w:numPr>
+          <w:ilvl w:val="0"/>
+          <w:numId w:val="2"/>
+        </w:numPr>
       </w:pPr>
       <w:r>
         <w:rPr>
           <w:b/>
           <w:bCs/>
-          <w:lang/>
         </w:rPr>
-        <w:t>Purchase Management</w:t>
+        <w:t xml:space="preserve"> </w:t>
       </w:r>
     </w:p>
-    <w:p>
-      <w:pPr>
-        <w:numPr>
-          <w:ilvl w:val="0"/>
-          <w:numId w:val="2"/>
-        </w:numPr>
-        <w:rPr>
-          <w:lang/>
-        </w:rPr>
-      </w:pPr>
-      <w:r>
-        <w:rPr>
-          <w:lang/>
-        </w:rPr>
-        <w:t>Raise purchase orders (PO)</w:t>
-      </w:r>
-    </w:p>
-    <w:p>
-      <w:pPr>
-        <w:numPr>
-          <w:ilvl w:val="0"/>
-          <w:numId w:val="2"/>
-        </w:numPr>
-        <w:rPr>
-          <w:lang/>
-        </w:rPr>
-      </w:pPr>
-      <w:r>
-        <w:rPr>
-          <w:lang/>
-        </w:rPr>
-        <w:t>Track PO statuses (pending, approved, received)</w:t>
-      </w:r>
-    </w:p>
-    <w:p>
-      <w:pPr>
-        <w:numPr>
-          <w:ilvl w:val="0"/>
-          <w:numId w:val="2"/>
-        </w:numPr>
-        <w:rPr>
-          <w:lang/>
-        </w:rPr>
-      </w:pPr>
-      <w:r>
-        <w:rPr>
-          <w:lang/>
-        </w:rPr>
-        <w:t>Simple supplier management (add/edit supplier details)</w:t>
-      </w:r>
-    </w:p>
-    <w:p>
-      <w:pPr>
-        <w:numPr>
-          <w:ilvl w:val="0"/>
-          <w:numId w:val="2"/>
-        </w:numPr>
-        <w:rPr>
-          <w:lang/>
-        </w:rPr>
-      </w:pPr>
-      <w:r>
-        <w:rPr>
-          <w:lang/>
-        </w:rPr>
-        <w:t>Invoice and receipt tracking</w:t>
-      </w:r>
-    </w:p>
+    <w:p/>
     <w:p>
       <w:pPr>
         <w:rPr>
           <w:b/>
           <w:bCs/>
-          <w:lang/>
         </w:rPr>
       </w:pPr>
       <w:r>
         <w:rPr>
           <w:b/>
           <w:bCs/>
-          <w:lang/>
+        </w:rPr>
+        <w:t>User Management</w:t>
+      </w:r>
+    </w:p>
+    <w:p>
+      <w:pPr>
+        <w:numPr>
+          <w:ilvl w:val="0"/>
+          <w:numId w:val="4"/>
+        </w:numPr>
+      </w:pPr>
+      <w:r>
+        <w:t>User roles and permissions (Admin, Employee)</w:t>
+      </w:r>
+    </w:p>
+    <w:p>
+      <w:pPr>
+        <w:numPr>
+          <w:ilvl w:val="0"/>
+          <w:numId w:val="4"/>
+        </w:numPr>
+      </w:pPr>
+      <w:r>
+        <w:t>Login and authentication</w:t>
+      </w:r>
+    </w:p>
+    <w:p>
+      <w:pPr>
+        <w:numPr>
+          <w:ilvl w:val="0"/>
+          <w:numId w:val="4"/>
+        </w:numPr>
+      </w:pPr>
+      <w:r>
+        <w:t>Detailed audit logs for user activities</w:t>
+      </w:r>
+    </w:p>
+    <w:p>
+      <w:pPr>
+        <w:numPr>
+          <w:ilvl w:val="0"/>
+          <w:numId w:val="4"/>
+        </w:numPr>
+      </w:pPr>
+      <w:r>
+        <w:t>Role-based access control</w:t>
+      </w:r>
+    </w:p>
+    <w:p/>
+    <w:p>
+      <w:pPr>
+        <w:rPr>
+          <w:b/>
+          <w:bCs/>
+        </w:rPr>
+      </w:pPr>
+      <w:r>
+        <w:rPr>
+          <w:b/>
+          <w:bCs/>
         </w:rPr>
         <w:t>Reporting</w:t>
       </w:r>
@@ -242,14 +201,8 @@
           <w:ilvl w:val="0"/>
           <w:numId w:val="3"/>
         </w:numPr>
-        <w:rPr>
-          <w:lang/>
-        </w:rPr>
       </w:pPr>
       <w:r>
-        <w:rPr>
-          <w:lang/>
-        </w:rPr>
         <w:t>Basic inventory reports (e.g., stock levels, purchase history)</w:t>
       </w:r>
     </w:p>
@@ -259,14 +212,8 @@
           <w:ilvl w:val="0"/>
           <w:numId w:val="3"/>
         </w:numPr>
-        <w:rPr>
-          <w:lang/>
-        </w:rPr>
       </w:pPr>
       <w:r>
-        <w:rPr>
-          <w:lang/>
-        </w:rPr>
         <w:t>Low stock and critical item alerts</w:t>
       </w:r>
     </w:p>
@@ -276,670 +223,11 @@
           <w:ilvl w:val="0"/>
           <w:numId w:val="3"/>
         </w:numPr>
-        <w:rPr>
-          <w:lang/>
-        </w:rPr>
       </w:pPr>
       <w:r>
-        <w:rPr>
-          <w:lang/>
-        </w:rPr>
         <w:t>Supplier performance summary</w:t>
       </w:r>
     </w:p>
-    <w:p>
-      <w:pPr>
-        <w:rPr>
-          <w:b/>
-          <w:bCs/>
-          <w:lang/>
-        </w:rPr>
-      </w:pPr>
-      <w:r>
-        <w:rPr>
-          <w:b/>
-          <w:bCs/>
-          <w:lang/>
-        </w:rPr>
-        <w:t>User Management</w:t>
-      </w:r>
-    </w:p>
-    <w:p>
-      <w:pPr>
-        <w:numPr>
-          <w:ilvl w:val="0"/>
-          <w:numId w:val="4"/>
-        </w:numPr>
-        <w:rPr>
-          <w:lang/>
-        </w:rPr>
-      </w:pPr>
-      <w:r>
-        <w:rPr>
-          <w:lang/>
-        </w:rPr>
-        <w:t>User roles and permissions (Admin, Employee)</w:t>
-      </w:r>
-    </w:p>
-    <w:p>
-      <w:pPr>
-        <w:numPr>
-          <w:ilvl w:val="0"/>
-          <w:numId w:val="4"/>
-        </w:numPr>
-        <w:rPr>
-          <w:lang/>
-        </w:rPr>
-      </w:pPr>
-      <w:r>
-        <w:rPr>
-          <w:lang/>
-        </w:rPr>
-        <w:t>Login and authentication</w:t>
-      </w:r>
-    </w:p>
-    <w:p>
-      <w:pPr>
-        <w:rPr>
-          <w:lang/>
-        </w:rPr>
-      </w:pPr>
-    </w:p>
-    <w:p>
-      <w:pPr>
-        <w:rPr>
-          <w:lang/>
-        </w:rPr>
-      </w:pPr>
-    </w:p>
-    <w:p>
-      <w:pPr>
-        <w:rPr>
-          <w:lang/>
-        </w:rPr>
-      </w:pPr>
-    </w:p>
-    <w:p>
-      <w:pPr>
-        <w:rPr>
-          <w:lang/>
-        </w:rPr>
-      </w:pPr>
-    </w:p>
-    <w:p>
-      <w:pPr>
-        <w:rPr>
-          <w:lang/>
-        </w:rPr>
-      </w:pPr>
-    </w:p>
-    <w:p>
-      <w:pPr>
-        <w:rPr>
-          <w:lang/>
-        </w:rPr>
-      </w:pPr>
-    </w:p>
-    <w:p>
-      <w:pPr>
-        <w:rPr>
-          <w:lang/>
-        </w:rPr>
-      </w:pPr>
-    </w:p>
-    <w:p>
-      <w:pPr>
-        <w:rPr>
-          <w:lang/>
-        </w:rPr>
-      </w:pPr>
-    </w:p>
-    <w:p>
-      <w:pPr>
-        <w:rPr>
-          <w:lang/>
-        </w:rPr>
-      </w:pPr>
-    </w:p>
-    <w:p>
-      <w:pPr>
-        <w:rPr>
-          <w:lang/>
-        </w:rPr>
-      </w:pPr>
-    </w:p>
-    <w:p>
-      <w:pPr>
-        <w:rPr>
-          <w:lang/>
-        </w:rPr>
-      </w:pPr>
-    </w:p>
-    <w:p>
-      <w:pPr>
-        <w:rPr>
-          <w:b/>
-          <w:bCs/>
-          <w:lang/>
-        </w:rPr>
-      </w:pPr>
-      <w:r>
-        <w:rPr>
-          <w:b/>
-          <w:bCs/>
-          <w:lang/>
-        </w:rPr>
-        <w:t>2. Medium Organization Features</w:t>
-      </w:r>
-    </w:p>
-    <w:p>
-      <w:pPr>
-        <w:rPr>
-          <w:lang/>
-        </w:rPr>
-      </w:pPr>
-      <w:r>
-        <w:rPr>
-          <w:lang/>
-        </w:rPr>
-        <w:t>These features accommodate more complex operations and scale.</w:t>
-      </w:r>
-    </w:p>
-    <w:p>
-      <w:pPr>
-        <w:rPr>
-          <w:b/>
-          <w:bCs/>
-          <w:lang/>
-        </w:rPr>
-      </w:pPr>
-      <w:r>
-        <w:rPr>
-          <w:b/>
-          <w:bCs/>
-          <w:lang/>
-        </w:rPr>
-        <w:t>Advanced Inventory Management</w:t>
-      </w:r>
-    </w:p>
-    <w:p>
-      <w:pPr>
-        <w:numPr>
-          <w:ilvl w:val="0"/>
-          <w:numId w:val="5"/>
-        </w:numPr>
-        <w:rPr>
-          <w:lang/>
-        </w:rPr>
-      </w:pPr>
-      <w:r>
-        <w:rPr>
-          <w:lang/>
-        </w:rPr>
-        <w:t>Batch/lot tracking</w:t>
-      </w:r>
-    </w:p>
-    <w:p>
-      <w:pPr>
-        <w:numPr>
-          <w:ilvl w:val="0"/>
-          <w:numId w:val="5"/>
-        </w:numPr>
-        <w:rPr>
-          <w:lang/>
-        </w:rPr>
-      </w:pPr>
-      <w:r>
-        <w:rPr>
-          <w:lang/>
-        </w:rPr>
-        <w:t>Inventory location tracking (warehouse, floor, department)</w:t>
-      </w:r>
-    </w:p>
-    <w:p>
-      <w:pPr>
-        <w:numPr>
-          <w:ilvl w:val="0"/>
-          <w:numId w:val="5"/>
-        </w:numPr>
-        <w:rPr>
-          <w:lang/>
-        </w:rPr>
-      </w:pPr>
-      <w:r>
-        <w:rPr>
-          <w:lang/>
-        </w:rPr>
-        <w:t>Stock valuation (FIFO, LIFO, Weighted Average)</w:t>
-      </w:r>
-    </w:p>
-    <w:p>
-      <w:pPr>
-        <w:numPr>
-          <w:ilvl w:val="0"/>
-          <w:numId w:val="5"/>
-        </w:numPr>
-        <w:rPr>
-          <w:lang/>
-        </w:rPr>
-      </w:pPr>
-      <w:r>
-        <w:rPr>
-          <w:lang/>
-        </w:rPr>
-        <w:t>Multi-category inventory handling</w:t>
-      </w:r>
-    </w:p>
-    <w:p>
-      <w:pPr>
-        <w:numPr>
-          <w:ilvl w:val="0"/>
-          <w:numId w:val="5"/>
-        </w:numPr>
-        <w:rPr>
-          <w:lang/>
-        </w:rPr>
-      </w:pPr>
-      <w:r>
-        <w:rPr>
-          <w:lang/>
-        </w:rPr>
-        <w:t>Expiry date tracking for perishable items</w:t>
-      </w:r>
-    </w:p>
-    <w:p>
-      <w:pPr>
-        <w:rPr>
-          <w:b/>
-          <w:bCs/>
-          <w:lang/>
-        </w:rPr>
-      </w:pPr>
-      <w:r>
-        <w:rPr>
-          <w:b/>
-          <w:bCs/>
-          <w:lang/>
-        </w:rPr>
-        <w:t>Supplier and Vendor Management</w:t>
-      </w:r>
-    </w:p>
-    <w:p>
-      <w:pPr>
-        <w:numPr>
-          <w:ilvl w:val="0"/>
-          <w:numId w:val="6"/>
-        </w:numPr>
-        <w:rPr>
-          <w:lang/>
-        </w:rPr>
-      </w:pPr>
-      <w:r>
-        <w:rPr>
-          <w:lang/>
-        </w:rPr>
-        <w:t>Supplier contracts and history</w:t>
-      </w:r>
-    </w:p>
-    <w:p>
-      <w:pPr>
-        <w:numPr>
-          <w:ilvl w:val="0"/>
-          <w:numId w:val="6"/>
-        </w:numPr>
-        <w:rPr>
-          <w:lang/>
-        </w:rPr>
-      </w:pPr>
-      <w:r>
-        <w:rPr>
-          <w:lang/>
-        </w:rPr>
-        <w:t>Manage multiple suppliers for the same item</w:t>
-      </w:r>
-    </w:p>
-    <w:p>
-      <w:pPr>
-        <w:numPr>
-          <w:ilvl w:val="0"/>
-          <w:numId w:val="6"/>
-        </w:numPr>
-        <w:rPr>
-          <w:lang/>
-        </w:rPr>
-      </w:pPr>
-      <w:r>
-        <w:rPr>
-          <w:lang/>
-        </w:rPr>
-        <w:t>Supplier performance metrics (e.g., delivery time, quality)</w:t>
-      </w:r>
-    </w:p>
-    <w:p>
-      <w:pPr>
-        <w:rPr>
-          <w:b/>
-          <w:bCs/>
-          <w:lang/>
-        </w:rPr>
-      </w:pPr>
-      <w:r>
-        <w:rPr>
-          <w:b/>
-          <w:bCs/>
-          <w:lang/>
-        </w:rPr>
-        <w:t>Procurement Management</w:t>
-      </w:r>
-    </w:p>
-    <w:p>
-      <w:pPr>
-        <w:numPr>
-          <w:ilvl w:val="0"/>
-          <w:numId w:val="7"/>
-        </w:numPr>
-        <w:rPr>
-          <w:lang/>
-        </w:rPr>
-      </w:pPr>
-      <w:r>
-        <w:rPr>
-          <w:lang/>
-        </w:rPr>
-        <w:t>Multi-level PO approval workflows</w:t>
-      </w:r>
-    </w:p>
-    <w:p>
-      <w:pPr>
-        <w:numPr>
-          <w:ilvl w:val="0"/>
-          <w:numId w:val="7"/>
-        </w:numPr>
-        <w:rPr>
-          <w:lang/>
-        </w:rPr>
-      </w:pPr>
-      <w:r>
-        <w:rPr>
-          <w:lang/>
-        </w:rPr>
-        <w:t>Budget allocation per department</w:t>
-      </w:r>
-    </w:p>
-    <w:p>
-      <w:pPr>
-        <w:numPr>
-          <w:ilvl w:val="0"/>
-          <w:numId w:val="7"/>
-        </w:numPr>
-        <w:rPr>
-          <w:lang/>
-        </w:rPr>
-      </w:pPr>
-      <w:r>
-        <w:rPr>
-          <w:lang/>
-        </w:rPr>
-        <w:t>Automated reorder point calculation</w:t>
-      </w:r>
-    </w:p>
-    <w:p>
-      <w:pPr>
-        <w:rPr>
-          <w:b/>
-          <w:bCs/>
-          <w:lang/>
-        </w:rPr>
-      </w:pPr>
-      <w:r>
-        <w:rPr>
-          <w:b/>
-          <w:bCs/>
-          <w:lang/>
-        </w:rPr>
-        <w:t>Asset Management</w:t>
-      </w:r>
-    </w:p>
-    <w:p>
-      <w:pPr>
-        <w:numPr>
-          <w:ilvl w:val="0"/>
-          <w:numId w:val="8"/>
-        </w:numPr>
-        <w:rPr>
-          <w:lang/>
-        </w:rPr>
-      </w:pPr>
-      <w:r>
-        <w:rPr>
-          <w:lang/>
-        </w:rPr>
-        <w:t>Asset tracking (e.g., IT equipment, furniture)</w:t>
-      </w:r>
-    </w:p>
-    <w:p>
-      <w:pPr>
-        <w:numPr>
-          <w:ilvl w:val="0"/>
-          <w:numId w:val="8"/>
-        </w:numPr>
-        <w:rPr>
-          <w:lang/>
-        </w:rPr>
-      </w:pPr>
-      <w:r>
-        <w:rPr>
-          <w:lang/>
-        </w:rPr>
-        <w:t>Assign assets to employees/departments</w:t>
-      </w:r>
-    </w:p>
-    <w:p>
-      <w:pPr>
-        <w:numPr>
-          <w:ilvl w:val="0"/>
-          <w:numId w:val="8"/>
-        </w:numPr>
-        <w:rPr>
-          <w:lang/>
-        </w:rPr>
-      </w:pPr>
-      <w:r>
-        <w:rPr>
-          <w:lang/>
-        </w:rPr>
-        <w:t>Maintenance schedules for assets</w:t>
-      </w:r>
-    </w:p>
-    <w:p>
-      <w:pPr>
-        <w:numPr>
-          <w:ilvl w:val="0"/>
-          <w:numId w:val="8"/>
-        </w:numPr>
-        <w:rPr>
-          <w:lang/>
-        </w:rPr>
-      </w:pPr>
-      <w:r>
-        <w:rPr>
-          <w:lang/>
-        </w:rPr>
-        <w:t>Depreciation tracking</w:t>
-      </w:r>
-    </w:p>
-    <w:p>
-      <w:pPr>
-        <w:rPr>
-          <w:b/>
-          <w:bCs/>
-          <w:lang/>
-        </w:rPr>
-      </w:pPr>
-      <w:r>
-        <w:rPr>
-          <w:b/>
-          <w:bCs/>
-          <w:lang/>
-        </w:rPr>
-        <w:t>Reporting and Insights</w:t>
-      </w:r>
-    </w:p>
-    <w:p>
-      <w:pPr>
-        <w:numPr>
-          <w:ilvl w:val="0"/>
-          <w:numId w:val="9"/>
-        </w:numPr>
-        <w:rPr>
-          <w:lang/>
-        </w:rPr>
-      </w:pPr>
-      <w:r>
-        <w:rPr>
-          <w:lang/>
-        </w:rPr>
-        <w:t>Inventory turnover reports</w:t>
-      </w:r>
-    </w:p>
-    <w:p>
-      <w:pPr>
-        <w:numPr>
-          <w:ilvl w:val="0"/>
-          <w:numId w:val="9"/>
-        </w:numPr>
-        <w:rPr>
-          <w:lang/>
-        </w:rPr>
-      </w:pPr>
-      <w:r>
-        <w:rPr>
-          <w:lang/>
-        </w:rPr>
-        <w:t>Purchase cost analysis</w:t>
-      </w:r>
-    </w:p>
-    <w:p>
-      <w:pPr>
-        <w:numPr>
-          <w:ilvl w:val="0"/>
-          <w:numId w:val="9"/>
-        </w:numPr>
-        <w:rPr>
-          <w:lang/>
-        </w:rPr>
-      </w:pPr>
-      <w:r>
-        <w:rPr>
-          <w:lang/>
-        </w:rPr>
-        <w:t>Consumption trend analysis</w:t>
-      </w:r>
-    </w:p>
-    <w:p>
-      <w:pPr>
-        <w:rPr>
-          <w:b/>
-          <w:bCs/>
-          <w:lang/>
-        </w:rPr>
-      </w:pPr>
-      <w:r>
-        <w:rPr>
-          <w:b/>
-          <w:bCs/>
-          <w:lang/>
-        </w:rPr>
-        <w:t>Integration</w:t>
-      </w:r>
-    </w:p>
-    <w:p>
-      <w:pPr>
-        <w:numPr>
-          <w:ilvl w:val="0"/>
-          <w:numId w:val="10"/>
-        </w:numPr>
-        <w:rPr>
-          <w:lang/>
-        </w:rPr>
-      </w:pPr>
-      <w:r>
-        <w:rPr>
-          <w:lang/>
-        </w:rPr>
-        <w:t>API integration with accounting tools (e.g., QuickBooks, Tally)</w:t>
-      </w:r>
-    </w:p>
-    <w:p>
-      <w:pPr>
-        <w:numPr>
-          <w:ilvl w:val="0"/>
-          <w:numId w:val="10"/>
-        </w:numPr>
-        <w:rPr>
-          <w:lang/>
-        </w:rPr>
-      </w:pPr>
-      <w:r>
-        <w:rPr>
-          <w:lang/>
-        </w:rPr>
-        <w:lastRenderedPageBreak/>
-        <w:t>Integration with HR systems for department alignment</w:t>
-      </w:r>
-    </w:p>
-    <w:p>
-      <w:pPr>
-        <w:rPr>
-          <w:b/>
-          <w:bCs/>
-          <w:lang/>
-        </w:rPr>
-      </w:pPr>
-      <w:r>
-        <w:rPr>
-          <w:b/>
-          <w:bCs/>
-          <w:lang/>
-        </w:rPr>
-        <w:t>User Management</w:t>
-      </w:r>
-    </w:p>
-    <w:p>
-      <w:pPr>
-        <w:numPr>
-          <w:ilvl w:val="0"/>
-          <w:numId w:val="11"/>
-        </w:numPr>
-        <w:rPr>
-          <w:lang/>
-        </w:rPr>
-      </w:pPr>
-      <w:r>
-        <w:rPr>
-          <w:lang/>
-        </w:rPr>
-        <w:t>Detailed audit logs for user activities</w:t>
-      </w:r>
-    </w:p>
-    <w:p>
-      <w:pPr>
-        <w:numPr>
-          <w:ilvl w:val="0"/>
-          <w:numId w:val="11"/>
-        </w:numPr>
-        <w:rPr>
-          <w:lang/>
-        </w:rPr>
-      </w:pPr>
-      <w:r>
-        <w:rPr>
-          <w:lang/>
-        </w:rPr>
-        <w:t>Role-based access control</w:t>
-      </w:r>
-    </w:p>
-    <w:p/>
     <w:sectPr>
       <w:pgSz w:w="12240" w:h="15840"/>
       <w:pgMar w:top="1440" w:right="1440" w:bottom="1440" w:left="1440" w:header="720" w:footer="720" w:gutter="0"/>
@@ -2593,135 +1881,36 @@
   </w:abstractNum>
   <w:num w:numId="1" w16cid:durableId="685987060">
     <w:abstractNumId w:val="8"/>
-    <w:lvlOverride w:ilvl="0"/>
-    <w:lvlOverride w:ilvl="1"/>
-    <w:lvlOverride w:ilvl="2"/>
-    <w:lvlOverride w:ilvl="3"/>
-    <w:lvlOverride w:ilvl="4"/>
-    <w:lvlOverride w:ilvl="5"/>
-    <w:lvlOverride w:ilvl="6"/>
-    <w:lvlOverride w:ilvl="7"/>
-    <w:lvlOverride w:ilvl="8"/>
   </w:num>
   <w:num w:numId="2" w16cid:durableId="1808427526">
     <w:abstractNumId w:val="10"/>
-    <w:lvlOverride w:ilvl="0"/>
-    <w:lvlOverride w:ilvl="1"/>
-    <w:lvlOverride w:ilvl="2"/>
-    <w:lvlOverride w:ilvl="3"/>
-    <w:lvlOverride w:ilvl="4"/>
-    <w:lvlOverride w:ilvl="5"/>
-    <w:lvlOverride w:ilvl="6"/>
-    <w:lvlOverride w:ilvl="7"/>
-    <w:lvlOverride w:ilvl="8"/>
   </w:num>
   <w:num w:numId="3" w16cid:durableId="1097557580">
     <w:abstractNumId w:val="6"/>
-    <w:lvlOverride w:ilvl="0"/>
-    <w:lvlOverride w:ilvl="1"/>
-    <w:lvlOverride w:ilvl="2"/>
-    <w:lvlOverride w:ilvl="3"/>
-    <w:lvlOverride w:ilvl="4"/>
-    <w:lvlOverride w:ilvl="5"/>
-    <w:lvlOverride w:ilvl="6"/>
-    <w:lvlOverride w:ilvl="7"/>
-    <w:lvlOverride w:ilvl="8"/>
   </w:num>
   <w:num w:numId="4" w16cid:durableId="1339504042">
     <w:abstractNumId w:val="9"/>
-    <w:lvlOverride w:ilvl="0"/>
-    <w:lvlOverride w:ilvl="1"/>
-    <w:lvlOverride w:ilvl="2"/>
-    <w:lvlOverride w:ilvl="3"/>
-    <w:lvlOverride w:ilvl="4"/>
-    <w:lvlOverride w:ilvl="5"/>
-    <w:lvlOverride w:ilvl="6"/>
-    <w:lvlOverride w:ilvl="7"/>
-    <w:lvlOverride w:ilvl="8"/>
   </w:num>
   <w:num w:numId="5" w16cid:durableId="315501477">
     <w:abstractNumId w:val="1"/>
-    <w:lvlOverride w:ilvl="0"/>
-    <w:lvlOverride w:ilvl="1"/>
-    <w:lvlOverride w:ilvl="2"/>
-    <w:lvlOverride w:ilvl="3"/>
-    <w:lvlOverride w:ilvl="4"/>
-    <w:lvlOverride w:ilvl="5"/>
-    <w:lvlOverride w:ilvl="6"/>
-    <w:lvlOverride w:ilvl="7"/>
-    <w:lvlOverride w:ilvl="8"/>
   </w:num>
   <w:num w:numId="6" w16cid:durableId="1981230433">
     <w:abstractNumId w:val="4"/>
-    <w:lvlOverride w:ilvl="0"/>
-    <w:lvlOverride w:ilvl="1"/>
-    <w:lvlOverride w:ilvl="2"/>
-    <w:lvlOverride w:ilvl="3"/>
-    <w:lvlOverride w:ilvl="4"/>
-    <w:lvlOverride w:ilvl="5"/>
-    <w:lvlOverride w:ilvl="6"/>
-    <w:lvlOverride w:ilvl="7"/>
-    <w:lvlOverride w:ilvl="8"/>
   </w:num>
   <w:num w:numId="7" w16cid:durableId="120727342">
     <w:abstractNumId w:val="5"/>
-    <w:lvlOverride w:ilvl="0"/>
-    <w:lvlOverride w:ilvl="1"/>
-    <w:lvlOverride w:ilvl="2"/>
-    <w:lvlOverride w:ilvl="3"/>
-    <w:lvlOverride w:ilvl="4"/>
-    <w:lvlOverride w:ilvl="5"/>
-    <w:lvlOverride w:ilvl="6"/>
-    <w:lvlOverride w:ilvl="7"/>
-    <w:lvlOverride w:ilvl="8"/>
   </w:num>
   <w:num w:numId="8" w16cid:durableId="319888196">
     <w:abstractNumId w:val="2"/>
-    <w:lvlOverride w:ilvl="0"/>
-    <w:lvlOverride w:ilvl="1"/>
-    <w:lvlOverride w:ilvl="2"/>
-    <w:lvlOverride w:ilvl="3"/>
-    <w:lvlOverride w:ilvl="4"/>
-    <w:lvlOverride w:ilvl="5"/>
-    <w:lvlOverride w:ilvl="6"/>
-    <w:lvlOverride w:ilvl="7"/>
-    <w:lvlOverride w:ilvl="8"/>
   </w:num>
   <w:num w:numId="9" w16cid:durableId="2116556062">
     <w:abstractNumId w:val="7"/>
-    <w:lvlOverride w:ilvl="0"/>
-    <w:lvlOverride w:ilvl="1"/>
-    <w:lvlOverride w:ilvl="2"/>
-    <w:lvlOverride w:ilvl="3"/>
-    <w:lvlOverride w:ilvl="4"/>
-    <w:lvlOverride w:ilvl="5"/>
-    <w:lvlOverride w:ilvl="6"/>
-    <w:lvlOverride w:ilvl="7"/>
-    <w:lvlOverride w:ilvl="8"/>
   </w:num>
   <w:num w:numId="10" w16cid:durableId="971911039">
     <w:abstractNumId w:val="0"/>
-    <w:lvlOverride w:ilvl="0"/>
-    <w:lvlOverride w:ilvl="1"/>
-    <w:lvlOverride w:ilvl="2"/>
-    <w:lvlOverride w:ilvl="3"/>
-    <w:lvlOverride w:ilvl="4"/>
-    <w:lvlOverride w:ilvl="5"/>
-    <w:lvlOverride w:ilvl="6"/>
-    <w:lvlOverride w:ilvl="7"/>
-    <w:lvlOverride w:ilvl="8"/>
   </w:num>
   <w:num w:numId="11" w16cid:durableId="1034307075">
     <w:abstractNumId w:val="3"/>
-    <w:lvlOverride w:ilvl="0"/>
-    <w:lvlOverride w:ilvl="1"/>
-    <w:lvlOverride w:ilvl="2"/>
-    <w:lvlOverride w:ilvl="3"/>
-    <w:lvlOverride w:ilvl="4"/>
-    <w:lvlOverride w:ilvl="5"/>
-    <w:lvlOverride w:ilvl="6"/>
-    <w:lvlOverride w:ilvl="7"/>
-    <w:lvlOverride w:ilvl="8"/>
   </w:num>
 </w:numbering>
 </file>
@@ -3329,6 +2518,7 @@
   <w:style w:type="character" w:default="1" w:styleId="DefaultParagraphFont">
     <w:name w:val="Default Paragraph Font"/>
     <w:uiPriority w:val="1"/>
+    <w:semiHidden/>
     <w:unhideWhenUsed/>
   </w:style>
   <w:style w:type="table" w:default="1" w:styleId="TableNormal">
@@ -3938,4 +3128,16 @@
     </a:ext>
   </a:extLst>
 </a:theme>
+</file>
+
+<file path=customXml/item1.xml><?xml version="1.0" encoding="utf-8"?>
+<b:Sources xmlns:b="http://schemas.openxmlformats.org/officeDocument/2006/bibliography" xmlns="http://schemas.openxmlformats.org/officeDocument/2006/bibliography" SelectedStyle="\APASixthEditionOfficeOnline.xsl" StyleName="APA" Version="6"/>
+</file>
+
+<file path=customXml/itemProps1.xml><?xml version="1.0" encoding="utf-8"?>
+<ds:datastoreItem xmlns:ds="http://schemas.openxmlformats.org/officeDocument/2006/customXml" ds:itemID="{E18DF24A-80FE-435E-93C3-DB01E64792D4}">
+  <ds:schemaRefs>
+    <ds:schemaRef ds:uri="http://schemas.openxmlformats.org/officeDocument/2006/bibliography"/>
+  </ds:schemaRefs>
+</ds:datastoreItem>
 </file>
</xml_diff>

<commit_message>
Add Roles and Login auth feature
</commit_message>
<xml_diff>
--- a/Document/Screen Document.docx
+++ b/Document/Screen Document.docx
@@ -14,7 +14,21 @@
           <w:b/>
           <w:bCs/>
         </w:rPr>
-        <w:t>1. Organization Features</w:t>
+        <w:t xml:space="preserve">1. </w:t>
+      </w:r>
+      <w:r>
+        <w:rPr>
+          <w:b/>
+          <w:bCs/>
+        </w:rPr>
+        <w:t>Application</w:t>
+      </w:r>
+      <w:r>
+        <w:rPr>
+          <w:b/>
+          <w:bCs/>
+        </w:rPr>
+        <w:t xml:space="preserve"> Features</w:t>
       </w:r>
     </w:p>
     <w:p>
@@ -45,7 +59,10 @@
         </w:numPr>
       </w:pPr>
       <w:r>
-        <w:t>Add/Edit/Delete inventory items</w:t>
+        <w:t>Create/Update/All</w:t>
+      </w:r>
+      <w:r>
+        <w:t xml:space="preserve"> inventory items</w:t>
       </w:r>
     </w:p>
     <w:p>
@@ -57,17 +74,6 @@
       </w:pPr>
       <w:r>
         <w:t>Track stock levels (quantity in/out)</w:t>
-      </w:r>
-    </w:p>
-    <w:p>
-      <w:pPr>
-        <w:numPr>
-          <w:ilvl w:val="0"/>
-          <w:numId w:val="1"/>
-        </w:numPr>
-      </w:pPr>
-      <w:r>
-        <w:t>Categorize inventory (e.g., office supplies, IT equipment)</w:t>
       </w:r>
     </w:p>
     <w:p>
@@ -106,17 +112,48 @@
     <w:p/>
     <w:p>
       <w:pPr>
-        <w:numPr>
-          <w:ilvl w:val="0"/>
-          <w:numId w:val="2"/>
-        </w:numPr>
+        <w:rPr>
+          <w:b/>
+          <w:bCs/>
+        </w:rPr>
       </w:pPr>
       <w:r>
         <w:rPr>
           <w:b/>
           <w:bCs/>
         </w:rPr>
-        <w:t xml:space="preserve"> </w:t>
+        <w:t>Suppler</w:t>
+      </w:r>
+      <w:r>
+        <w:rPr>
+          <w:b/>
+          <w:bCs/>
+        </w:rPr>
+        <w:t xml:space="preserve"> Managemen</w:t>
+      </w:r>
+      <w:r>
+        <w:rPr>
+          <w:b/>
+          <w:bCs/>
+        </w:rPr>
+        <w:t>t</w:t>
+      </w:r>
+    </w:p>
+    <w:p>
+      <w:pPr>
+        <w:numPr>
+          <w:ilvl w:val="0"/>
+          <w:numId w:val="4"/>
+        </w:numPr>
+      </w:pPr>
+      <w:r>
+        <w:t xml:space="preserve">Add/Edit/Delete </w:t>
+      </w:r>
+      <w:r>
+        <w:t>Su</w:t>
+      </w:r>
+      <w:r>
+        <w:t>ppliers</w:t>
       </w:r>
     </w:p>
     <w:p/>
@@ -165,17 +202,6 @@
         </w:numPr>
       </w:pPr>
       <w:r>
-        <w:t>Detailed audit logs for user activities</w:t>
-      </w:r>
-    </w:p>
-    <w:p>
-      <w:pPr>
-        <w:numPr>
-          <w:ilvl w:val="0"/>
-          <w:numId w:val="4"/>
-        </w:numPr>
-      </w:pPr>
-      <w:r>
         <w:t>Role-based access control</w:t>
       </w:r>
     </w:p>
@@ -225,9 +251,13 @@
         </w:numPr>
       </w:pPr>
       <w:r>
-        <w:t>Supplier performance summary</w:t>
+        <w:t>Supplier</w:t>
+      </w:r>
+      <w:r>
+        <w:t xml:space="preserve"> Detail</w:t>
       </w:r>
     </w:p>
+    <w:p/>
     <w:sectPr>
       <w:pgSz w:w="12240" w:h="15840"/>
       <w:pgMar w:top="1440" w:right="1440" w:bottom="1440" w:left="1440" w:header="720" w:footer="720" w:gutter="0"/>

</xml_diff>